<commit_message>
Documentacion y scrip para procedimientos almacenados sql
</commit_message>
<xml_diff>
--- a/Gestión/1.1.2_Documento_de_registro_de_definiciB3n_e_identificaciB3n_del_proyecto.docx
+++ b/Gestión/1.1.2_Documento_de_registro_de_definiciB3n_e_identificaciB3n_del_proyecto.docx
@@ -1,6 +1,6 @@
 
 <file path=word/document.xml><?xml version="1.0" encoding="utf-8"?>
-<w:document xmlns:wpc="http://schemas.microsoft.com/office/word/2010/wordprocessingCanvas" xmlns:cx="http://schemas.microsoft.com/office/drawing/2014/chartex" xmlns:cx1="http://schemas.microsoft.com/office/drawing/2015/9/8/chartex" xmlns:cx2="http://schemas.microsoft.com/office/drawing/2015/10/21/chartex" xmlns:cx3="http://schemas.microsoft.com/office/drawing/2016/5/9/chartex" xmlns:cx4="http://schemas.microsoft.com/office/drawing/2016/5/10/chartex" xmlns:cx5="http://schemas.microsoft.com/office/drawing/2016/5/11/chartex" xmlns:cx6="http://schemas.microsoft.com/office/drawing/2016/5/12/chartex" xmlns:cx7="http://schemas.microsoft.com/office/drawing/2016/5/13/chartex" xmlns:cx8="http://schemas.microsoft.com/office/drawing/2016/5/14/chartex" xmlns:mc="http://schemas.openxmlformats.org/markup-compatibility/2006" xmlns:aink="http://schemas.microsoft.com/office/drawing/2016/ink" xmlns:am3d="http://schemas.microsoft.com/office/drawing/2017/model3d" xmlns:o="urn:schemas-microsoft-com:office:office" xmlns:r="http://schemas.openxmlformats.org/officeDocument/2006/relationships" xmlns:m="http://schemas.openxmlformats.org/officeDocument/2006/math" xmlns:v="urn:schemas-microsoft-com:vml" xmlns:wp14="http://schemas.microsoft.com/office/word/2010/wordprocessingDrawing" xmlns:wp="http://schemas.openxmlformats.org/drawingml/2006/wordprocessingDrawing" xmlns:w10="urn:schemas-microsoft-com:office:word" xmlns:w="http://schemas.openxmlformats.org/wordprocessingml/2006/main" xmlns:w14="http://schemas.microsoft.com/office/word/2010/wordml" xmlns:w15="http://schemas.microsoft.com/office/word/2012/wordml" xmlns:w16cex="http://schemas.microsoft.com/office/word/2018/wordml/cex" xmlns:w16cid="http://schemas.microsoft.com/office/word/2016/wordml/cid" xmlns:w16="http://schemas.microsoft.com/office/word/2018/wordml" xmlns:w16sdtdh="http://schemas.microsoft.com/office/word/2020/wordml/sdtdatahash" xmlns:w16se="http://schemas.microsoft.com/office/word/2015/wordml/symex" xmlns:wpg="http://schemas.microsoft.com/office/word/2010/wordprocessingGroup" xmlns:wpi="http://schemas.microsoft.com/office/word/2010/wordprocessingInk" xmlns:wne="http://schemas.microsoft.com/office/word/2006/wordml" xmlns:wps="http://schemas.microsoft.com/office/word/2010/wordprocessingShape" mc:Ignorable="w14 w15 w16se w16cid w16 w16cex w16sdtdh wp14">
+<w:document xmlns:wpc="http://schemas.microsoft.com/office/word/2010/wordprocessingCanvas" xmlns:cx="http://schemas.microsoft.com/office/drawing/2014/chartex" xmlns:cx1="http://schemas.microsoft.com/office/drawing/2015/9/8/chartex" xmlns:cx2="http://schemas.microsoft.com/office/drawing/2015/10/21/chartex" xmlns:cx3="http://schemas.microsoft.com/office/drawing/2016/5/9/chartex" xmlns:cx4="http://schemas.microsoft.com/office/drawing/2016/5/10/chartex" xmlns:cx5="http://schemas.microsoft.com/office/drawing/2016/5/11/chartex" xmlns:cx6="http://schemas.microsoft.com/office/drawing/2016/5/12/chartex" xmlns:cx7="http://schemas.microsoft.com/office/drawing/2016/5/13/chartex" xmlns:cx8="http://schemas.microsoft.com/office/drawing/2016/5/14/chartex" xmlns:mc="http://schemas.openxmlformats.org/markup-compatibility/2006" xmlns:aink="http://schemas.microsoft.com/office/drawing/2016/ink" xmlns:am3d="http://schemas.microsoft.com/office/drawing/2017/model3d" xmlns:o="urn:schemas-microsoft-com:office:office" xmlns:oel="http://schemas.microsoft.com/office/2019/extlst" xmlns:r="http://schemas.openxmlformats.org/officeDocument/2006/relationships" xmlns:m="http://schemas.openxmlformats.org/officeDocument/2006/math" xmlns:v="urn:schemas-microsoft-com:vml" xmlns:wp14="http://schemas.microsoft.com/office/word/2010/wordprocessingDrawing" xmlns:wp="http://schemas.openxmlformats.org/drawingml/2006/wordprocessingDrawing" xmlns:w10="urn:schemas-microsoft-com:office:word" xmlns:w="http://schemas.openxmlformats.org/wordprocessingml/2006/main" xmlns:w14="http://schemas.microsoft.com/office/word/2010/wordml" xmlns:w15="http://schemas.microsoft.com/office/word/2012/wordml" xmlns:w16cex="http://schemas.microsoft.com/office/word/2018/wordml/cex" xmlns:w16cid="http://schemas.microsoft.com/office/word/2016/wordml/cid" xmlns:w16="http://schemas.microsoft.com/office/word/2018/wordml" xmlns:w16du="http://schemas.microsoft.com/office/word/2023/wordml/word16du" xmlns:w16sdtdh="http://schemas.microsoft.com/office/word/2020/wordml/sdtdatahash" xmlns:w16sdtfl="http://schemas.microsoft.com/office/word/2024/wordml/sdtformatlock" xmlns:w16se="http://schemas.microsoft.com/office/word/2015/wordml/symex" xmlns:wpg="http://schemas.microsoft.com/office/word/2010/wordprocessingGroup" xmlns:wpi="http://schemas.microsoft.com/office/word/2010/wordprocessingInk" xmlns:wne="http://schemas.microsoft.com/office/word/2006/wordml" xmlns:wps="http://schemas.microsoft.com/office/word/2010/wordprocessingShape" mc:Ignorable="w14 w15 w16se w16cid w16 w16cex w16sdtdh w16sdtfl w16du wp14">
   <w:body>
     <w:tbl>
       <w:tblPr>
@@ -1002,7 +1002,7 @@
               </wp:anchor>
             </w:drawing>
           </mc:Choice>
-          <mc:Fallback xmlns:asvg="http://schemas.microsoft.com/office/drawing/2016/SVG/main" xmlns:pic="http://schemas.openxmlformats.org/drawingml/2006/picture" xmlns:a="http://schemas.openxmlformats.org/drawingml/2006/main" xmlns:w16sdtfl="http://schemas.microsoft.com/office/word/2024/wordml/sdtformatlock" xmlns:w16du="http://schemas.microsoft.com/office/word/2023/wordml/word16du" xmlns:oel="http://schemas.microsoft.com/office/2019/extlst">
+          <mc:Fallback xmlns:a="http://schemas.openxmlformats.org/drawingml/2006/main" xmlns:pic="http://schemas.openxmlformats.org/drawingml/2006/picture" xmlns:asvg="http://schemas.microsoft.com/office/drawing/2016/SVG/main">
             <w:pict>
               <v:line id="Conector recto 12" style="position:absolute;flip:y;z-index:251671555;visibility:visible;mso-wrap-style:square;mso-width-percent:0;mso-height-percent:0;mso-wrap-distance-left:9pt;mso-wrap-distance-top:-3e-5mm;mso-wrap-distance-right:9pt;mso-wrap-distance-bottom:-3e-5mm;mso-position-horizontal:absolute;mso-position-horizontal-relative:text;mso-position-vertical:absolute;mso-position-vertical-relative:text;mso-width-percent:0;mso-height-percent:0;mso-width-relative:margin;mso-height-relative:margin" o:spid="_x0000_s1026" strokecolor="#b4c6e7 [1300]" strokeweight=".5pt" from="1.2pt,6.25pt" to="440.55pt,6.25pt" w14:anchorId="0C8B07C6" o:gfxdata="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">
                 <v:stroke joinstyle="miter"/>
@@ -1323,7 +1323,7 @@
               </wp:anchor>
             </w:drawing>
           </mc:Choice>
-          <mc:Fallback xmlns:asvg="http://schemas.microsoft.com/office/drawing/2016/SVG/main" xmlns:pic="http://schemas.openxmlformats.org/drawingml/2006/picture" xmlns:a="http://schemas.openxmlformats.org/drawingml/2006/main" xmlns:w16sdtfl="http://schemas.microsoft.com/office/word/2024/wordml/sdtformatlock" xmlns:w16du="http://schemas.microsoft.com/office/word/2023/wordml/word16du" xmlns:oel="http://schemas.microsoft.com/office/2019/extlst">
+          <mc:Fallback xmlns:a="http://schemas.openxmlformats.org/drawingml/2006/main" xmlns:pic="http://schemas.openxmlformats.org/drawingml/2006/picture" xmlns:asvg="http://schemas.microsoft.com/office/drawing/2016/SVG/main">
             <w:pict>
               <v:line id="Conector recto 11" style="position:absolute;z-index:251673603;visibility:visible;mso-wrap-style:square;mso-width-percent:0;mso-height-percent:0;mso-wrap-distance-left:9pt;mso-wrap-distance-top:-3e-5mm;mso-wrap-distance-right:9pt;mso-wrap-distance-bottom:-3e-5mm;mso-position-horizontal:absolute;mso-position-horizontal-relative:text;mso-position-vertical:absolute;mso-position-vertical-relative:text;mso-width-percent:0;mso-height-percent:0;mso-width-relative:page;mso-height-relative:page" o:spid="_x0000_s1026" strokecolor="#b4c6e7 [1300]" strokeweight=".5pt" from="0,-.05pt" to="440.15pt,-.05pt" w14:anchorId="4878FEF2" o:gfxdata="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">
                 <v:stroke joinstyle="miter"/>
@@ -1697,7 +1697,7 @@
               </wp:anchor>
             </w:drawing>
           </mc:Choice>
-          <mc:Fallback xmlns:asvg="http://schemas.microsoft.com/office/drawing/2016/SVG/main" xmlns:pic="http://schemas.openxmlformats.org/drawingml/2006/picture" xmlns:a="http://schemas.openxmlformats.org/drawingml/2006/main" xmlns:w16sdtfl="http://schemas.microsoft.com/office/word/2024/wordml/sdtformatlock" xmlns:w16du="http://schemas.microsoft.com/office/word/2023/wordml/word16du" xmlns:oel="http://schemas.microsoft.com/office/2019/extlst">
+          <mc:Fallback xmlns:a="http://schemas.openxmlformats.org/drawingml/2006/main" xmlns:pic="http://schemas.openxmlformats.org/drawingml/2006/picture" xmlns:asvg="http://schemas.microsoft.com/office/drawing/2016/SVG/main">
             <w:pict>
               <v:line id="Conector recto 10" style="position:absolute;z-index:251675651;visibility:visible;mso-wrap-style:square;mso-width-percent:0;mso-height-percent:0;mso-wrap-distance-left:9pt;mso-wrap-distance-top:-3e-5mm;mso-wrap-distance-right:9pt;mso-wrap-distance-bottom:-3e-5mm;mso-position-horizontal:absolute;mso-position-horizontal-relative:text;mso-position-vertical:absolute;mso-position-vertical-relative:text;mso-width-percent:0;mso-height-percent:0;mso-width-relative:margin;mso-height-relative:margin" o:spid="_x0000_s1026" strokecolor="#b4c6e7 [1300]" strokeweight=".5pt" from="-.05pt,3.4pt" to="440.1pt,3.4pt" w14:anchorId="4A06B2A9" o:gfxdata="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">
                 <v:stroke joinstyle="miter"/>
@@ -4435,7 +4435,29 @@
                 <w:szCs w:val="20"/>
                 <w:lang w:val="es-ES"/>
               </w:rPr>
-              <w:t xml:space="preserve">Existen apps como roomster o Grupos de </w:t>
+              <w:t xml:space="preserve">Existen </w:t>
+            </w:r>
+            <w:proofErr w:type="gramStart"/>
+            <w:r>
+              <w:rPr>
+                <w:rFonts w:ascii="Calibri" w:eastAsia="Calibri" w:hAnsi="Calibri" w:cs="Calibri"/>
+                <w:color w:val="548DD4"/>
+                <w:sz w:val="20"/>
+                <w:szCs w:val="20"/>
+                <w:lang w:val="es-ES"/>
+              </w:rPr>
+              <w:t>apps</w:t>
+            </w:r>
+            <w:proofErr w:type="gramEnd"/>
+            <w:r>
+              <w:rPr>
+                <w:rFonts w:ascii="Calibri" w:eastAsia="Calibri" w:hAnsi="Calibri" w:cs="Calibri"/>
+                <w:color w:val="548DD4"/>
+                <w:sz w:val="20"/>
+                <w:szCs w:val="20"/>
+                <w:lang w:val="es-ES"/>
+              </w:rPr>
+              <w:t xml:space="preserve"> como roomster o Grupos de </w:t>
             </w:r>
             <w:proofErr w:type="gramStart"/>
             <w:r>
@@ -10332,6 +10354,7 @@
               <w:bottom w:val="single" w:sz="6" w:space="0" w:color="BFBFBF" w:themeColor="background1" w:themeShade="BF"/>
               <w:right w:val="single" w:sz="6" w:space="0" w:color="BFBFBF" w:themeColor="background1" w:themeShade="BF"/>
             </w:tcBorders>
+            <w:shd w:val="clear" w:color="auto" w:fill="70AD47" w:themeFill="accent6"/>
             <w:tcMar>
               <w:left w:w="105" w:type="dxa"/>
               <w:right w:w="105" w:type="dxa"/>
@@ -10358,6 +10381,7 @@
               <w:bottom w:val="single" w:sz="6" w:space="0" w:color="BFBFBF" w:themeColor="background1" w:themeShade="BF"/>
               <w:right w:val="single" w:sz="6" w:space="0" w:color="BFBFBF" w:themeColor="background1" w:themeShade="BF"/>
             </w:tcBorders>
+            <w:shd w:val="clear" w:color="auto" w:fill="70AD47" w:themeFill="accent6"/>
             <w:tcMar>
               <w:left w:w="105" w:type="dxa"/>
               <w:right w:w="105" w:type="dxa"/>
@@ -10865,6 +10889,7 @@
               <w:bottom w:val="single" w:sz="6" w:space="0" w:color="BFBFBF" w:themeColor="background1" w:themeShade="BF"/>
               <w:right w:val="single" w:sz="6" w:space="0" w:color="BFBFBF" w:themeColor="background1" w:themeShade="BF"/>
             </w:tcBorders>
+            <w:shd w:val="clear" w:color="auto" w:fill="385623" w:themeFill="accent6" w:themeFillShade="80"/>
             <w:tcMar>
               <w:left w:w="105" w:type="dxa"/>
               <w:right w:w="105" w:type="dxa"/>
@@ -10891,6 +10916,7 @@
               <w:bottom w:val="single" w:sz="6" w:space="0" w:color="BFBFBF" w:themeColor="background1" w:themeShade="BF"/>
               <w:right w:val="single" w:sz="6" w:space="0" w:color="BFBFBF" w:themeColor="background1" w:themeShade="BF"/>
             </w:tcBorders>
+            <w:shd w:val="clear" w:color="auto" w:fill="385623" w:themeFill="accent6" w:themeFillShade="80"/>
             <w:tcMar>
               <w:left w:w="105" w:type="dxa"/>
               <w:right w:w="105" w:type="dxa"/>
@@ -11398,6 +11424,7 @@
               <w:bottom w:val="single" w:sz="6" w:space="0" w:color="BFBFBF" w:themeColor="background1" w:themeShade="BF"/>
               <w:right w:val="single" w:sz="6" w:space="0" w:color="BFBFBF" w:themeColor="background1" w:themeShade="BF"/>
             </w:tcBorders>
+            <w:shd w:val="clear" w:color="auto" w:fill="538135" w:themeFill="accent6" w:themeFillShade="BF"/>
             <w:tcMar>
               <w:left w:w="105" w:type="dxa"/>
               <w:right w:w="105" w:type="dxa"/>
@@ -11424,6 +11451,7 @@
               <w:bottom w:val="single" w:sz="6" w:space="0" w:color="BFBFBF" w:themeColor="background1" w:themeShade="BF"/>
               <w:right w:val="single" w:sz="6" w:space="0" w:color="BFBFBF" w:themeColor="background1" w:themeShade="BF"/>
             </w:tcBorders>
+            <w:shd w:val="clear" w:color="auto" w:fill="538135" w:themeFill="accent6" w:themeFillShade="BF"/>
             <w:tcMar>
               <w:left w:w="105" w:type="dxa"/>
               <w:right w:w="105" w:type="dxa"/>
@@ -11840,8 +11868,18 @@
                 <w:sz w:val="16"/>
                 <w:szCs w:val="16"/>
               </w:rPr>
-              <w:t>Desarrollo backend</w:t>
-            </w:r>
+              <w:t xml:space="preserve">Desarrollo </w:t>
+            </w:r>
+            <w:proofErr w:type="spellStart"/>
+            <w:r>
+              <w:rPr>
+                <w:rFonts w:ascii="Calibri" w:eastAsia="Calibri" w:hAnsi="Calibri" w:cs="Calibri"/>
+                <w:sz w:val="16"/>
+                <w:szCs w:val="16"/>
+              </w:rPr>
+              <w:t>backend</w:t>
+            </w:r>
+            <w:proofErr w:type="spellEnd"/>
           </w:p>
         </w:tc>
         <w:tc>
@@ -11957,6 +11995,7 @@
               <w:bottom w:val="single" w:sz="6" w:space="0" w:color="BFBFBF" w:themeColor="background1" w:themeShade="BF"/>
               <w:right w:val="single" w:sz="6" w:space="0" w:color="BFBFBF" w:themeColor="background1" w:themeShade="BF"/>
             </w:tcBorders>
+            <w:shd w:val="clear" w:color="auto" w:fill="9CC2E5" w:themeFill="accent5" w:themeFillTint="99"/>
             <w:tcMar>
               <w:left w:w="105" w:type="dxa"/>
               <w:right w:w="105" w:type="dxa"/>
@@ -11983,6 +12022,7 @@
               <w:bottom w:val="single" w:sz="6" w:space="0" w:color="BFBFBF" w:themeColor="background1" w:themeShade="BF"/>
               <w:right w:val="single" w:sz="6" w:space="0" w:color="BFBFBF" w:themeColor="background1" w:themeShade="BF"/>
             </w:tcBorders>
+            <w:shd w:val="clear" w:color="auto" w:fill="9CC2E5" w:themeFill="accent5" w:themeFillTint="99"/>
             <w:tcMar>
               <w:left w:w="105" w:type="dxa"/>
               <w:right w:w="105" w:type="dxa"/>
@@ -12009,6 +12049,7 @@
               <w:bottom w:val="single" w:sz="6" w:space="0" w:color="BFBFBF" w:themeColor="background1" w:themeShade="BF"/>
               <w:right w:val="single" w:sz="6" w:space="0" w:color="BFBFBF" w:themeColor="background1" w:themeShade="BF"/>
             </w:tcBorders>
+            <w:shd w:val="clear" w:color="auto" w:fill="9CC2E5" w:themeFill="accent5" w:themeFillTint="99"/>
             <w:tcMar>
               <w:left w:w="105" w:type="dxa"/>
               <w:right w:w="105" w:type="dxa"/>
@@ -12035,6 +12076,7 @@
               <w:bottom w:val="single" w:sz="6" w:space="0" w:color="BFBFBF" w:themeColor="background1" w:themeShade="BF"/>
               <w:right w:val="single" w:sz="6" w:space="0" w:color="BFBFBF" w:themeColor="background1" w:themeShade="BF"/>
             </w:tcBorders>
+            <w:shd w:val="clear" w:color="auto" w:fill="9CC2E5" w:themeFill="accent5" w:themeFillTint="99"/>
             <w:tcMar>
               <w:left w:w="105" w:type="dxa"/>
               <w:right w:w="105" w:type="dxa"/>
@@ -12061,6 +12103,7 @@
               <w:bottom w:val="single" w:sz="6" w:space="0" w:color="BFBFBF" w:themeColor="background1" w:themeShade="BF"/>
               <w:right w:val="single" w:sz="6" w:space="0" w:color="BFBFBF" w:themeColor="background1" w:themeShade="BF"/>
             </w:tcBorders>
+            <w:shd w:val="clear" w:color="auto" w:fill="9CC2E5" w:themeFill="accent5" w:themeFillTint="99"/>
             <w:tcMar>
               <w:left w:w="105" w:type="dxa"/>
               <w:right w:w="105" w:type="dxa"/>
@@ -12087,6 +12130,7 @@
               <w:bottom w:val="single" w:sz="6" w:space="0" w:color="BFBFBF" w:themeColor="background1" w:themeShade="BF"/>
               <w:right w:val="single" w:sz="6" w:space="0" w:color="BFBFBF" w:themeColor="background1" w:themeShade="BF"/>
             </w:tcBorders>
+            <w:shd w:val="clear" w:color="auto" w:fill="9CC2E5" w:themeFill="accent5" w:themeFillTint="99"/>
             <w:tcMar>
               <w:left w:w="105" w:type="dxa"/>
               <w:right w:w="105" w:type="dxa"/>
@@ -12358,8 +12402,18 @@
                 <w:sz w:val="16"/>
                 <w:szCs w:val="16"/>
               </w:rPr>
-              <w:t>Desarrollo Frontend</w:t>
-            </w:r>
+              <w:t xml:space="preserve">Desarrollo </w:t>
+            </w:r>
+            <w:proofErr w:type="spellStart"/>
+            <w:r>
+              <w:rPr>
+                <w:rFonts w:ascii="Calibri" w:eastAsia="Calibri" w:hAnsi="Calibri" w:cs="Calibri"/>
+                <w:sz w:val="16"/>
+                <w:szCs w:val="16"/>
+              </w:rPr>
+              <w:t>Frontend</w:t>
+            </w:r>
+            <w:proofErr w:type="spellEnd"/>
           </w:p>
         </w:tc>
         <w:tc>
@@ -12527,6 +12581,7 @@
               <w:bottom w:val="single" w:sz="6" w:space="0" w:color="BFBFBF" w:themeColor="background1" w:themeShade="BF"/>
               <w:right w:val="single" w:sz="6" w:space="0" w:color="BFBFBF" w:themeColor="background1" w:themeShade="BF"/>
             </w:tcBorders>
+            <w:shd w:val="clear" w:color="auto" w:fill="B4C6E7" w:themeFill="accent1" w:themeFillTint="66"/>
             <w:tcMar>
               <w:left w:w="105" w:type="dxa"/>
               <w:right w:w="105" w:type="dxa"/>
@@ -12553,6 +12608,7 @@
               <w:bottom w:val="single" w:sz="6" w:space="0" w:color="BFBFBF" w:themeColor="background1" w:themeShade="BF"/>
               <w:right w:val="single" w:sz="6" w:space="0" w:color="BFBFBF" w:themeColor="background1" w:themeShade="BF"/>
             </w:tcBorders>
+            <w:shd w:val="clear" w:color="auto" w:fill="B4C6E7" w:themeFill="accent1" w:themeFillTint="66"/>
             <w:tcMar>
               <w:left w:w="105" w:type="dxa"/>
               <w:right w:w="105" w:type="dxa"/>
@@ -12579,6 +12635,7 @@
               <w:bottom w:val="single" w:sz="6" w:space="0" w:color="BFBFBF" w:themeColor="background1" w:themeShade="BF"/>
               <w:right w:val="single" w:sz="6" w:space="0" w:color="BFBFBF" w:themeColor="background1" w:themeShade="BF"/>
             </w:tcBorders>
+            <w:shd w:val="clear" w:color="auto" w:fill="B4C6E7" w:themeFill="accent1" w:themeFillTint="66"/>
             <w:tcMar>
               <w:left w:w="105" w:type="dxa"/>
               <w:right w:w="105" w:type="dxa"/>
@@ -12605,6 +12662,7 @@
               <w:bottom w:val="single" w:sz="6" w:space="0" w:color="BFBFBF" w:themeColor="background1" w:themeShade="BF"/>
               <w:right w:val="single" w:sz="6" w:space="0" w:color="BFBFBF" w:themeColor="background1" w:themeShade="BF"/>
             </w:tcBorders>
+            <w:shd w:val="clear" w:color="auto" w:fill="B4C6E7" w:themeFill="accent1" w:themeFillTint="66"/>
             <w:tcMar>
               <w:left w:w="105" w:type="dxa"/>
               <w:right w:w="105" w:type="dxa"/>
@@ -12631,6 +12689,7 @@
               <w:bottom w:val="single" w:sz="6" w:space="0" w:color="BFBFBF" w:themeColor="background1" w:themeShade="BF"/>
               <w:right w:val="single" w:sz="6" w:space="0" w:color="BFBFBF" w:themeColor="background1" w:themeShade="BF"/>
             </w:tcBorders>
+            <w:shd w:val="clear" w:color="auto" w:fill="B4C6E7" w:themeFill="accent1" w:themeFillTint="66"/>
             <w:tcMar>
               <w:left w:w="105" w:type="dxa"/>
               <w:right w:w="105" w:type="dxa"/>
@@ -12657,6 +12716,7 @@
               <w:bottom w:val="single" w:sz="6" w:space="0" w:color="BFBFBF" w:themeColor="background1" w:themeShade="BF"/>
               <w:right w:val="single" w:sz="6" w:space="0" w:color="BFBFBF" w:themeColor="background1" w:themeShade="BF"/>
             </w:tcBorders>
+            <w:shd w:val="clear" w:color="auto" w:fill="B4C6E7" w:themeFill="accent1" w:themeFillTint="66"/>
             <w:tcMar>
               <w:left w:w="105" w:type="dxa"/>
               <w:right w:w="105" w:type="dxa"/>
@@ -12982,6 +13042,7 @@
               <w:bottom w:val="single" w:sz="6" w:space="0" w:color="BFBFBF" w:themeColor="background1" w:themeShade="BF"/>
               <w:right w:val="single" w:sz="6" w:space="0" w:color="BFBFBF" w:themeColor="background1" w:themeShade="BF"/>
             </w:tcBorders>
+            <w:shd w:val="clear" w:color="auto" w:fill="4472C4" w:themeFill="accent1"/>
             <w:tcMar>
               <w:left w:w="105" w:type="dxa"/>
               <w:right w:w="105" w:type="dxa"/>
@@ -13008,6 +13069,7 @@
               <w:bottom w:val="single" w:sz="6" w:space="0" w:color="BFBFBF" w:themeColor="background1" w:themeShade="BF"/>
               <w:right w:val="single" w:sz="6" w:space="0" w:color="BFBFBF" w:themeColor="background1" w:themeShade="BF"/>
             </w:tcBorders>
+            <w:shd w:val="clear" w:color="auto" w:fill="4472C4" w:themeFill="accent1"/>
             <w:tcMar>
               <w:left w:w="105" w:type="dxa"/>
               <w:right w:w="105" w:type="dxa"/>
@@ -13034,6 +13096,7 @@
               <w:bottom w:val="single" w:sz="6" w:space="0" w:color="BFBFBF" w:themeColor="background1" w:themeShade="BF"/>
               <w:right w:val="single" w:sz="6" w:space="0" w:color="BFBFBF" w:themeColor="background1" w:themeShade="BF"/>
             </w:tcBorders>
+            <w:shd w:val="clear" w:color="auto" w:fill="4472C4" w:themeFill="accent1"/>
             <w:tcMar>
               <w:left w:w="105" w:type="dxa"/>
               <w:right w:w="105" w:type="dxa"/>
@@ -13489,6 +13552,7 @@
               <w:bottom w:val="single" w:sz="6" w:space="0" w:color="BFBFBF" w:themeColor="background1" w:themeShade="BF"/>
               <w:right w:val="single" w:sz="6" w:space="0" w:color="BFBFBF" w:themeColor="background1" w:themeShade="BF"/>
             </w:tcBorders>
+            <w:shd w:val="clear" w:color="auto" w:fill="FFFFFF" w:themeFill="background1"/>
             <w:tcMar>
               <w:left w:w="105" w:type="dxa"/>
               <w:right w:w="105" w:type="dxa"/>
@@ -13515,6 +13579,7 @@
               <w:bottom w:val="single" w:sz="6" w:space="0" w:color="BFBFBF" w:themeColor="background1" w:themeShade="BF"/>
               <w:right w:val="single" w:sz="6" w:space="0" w:color="BFBFBF" w:themeColor="background1" w:themeShade="BF"/>
             </w:tcBorders>
+            <w:shd w:val="clear" w:color="auto" w:fill="FFFFFF" w:themeFill="background1"/>
             <w:tcMar>
               <w:left w:w="105" w:type="dxa"/>
               <w:right w:w="105" w:type="dxa"/>
@@ -13541,6 +13606,7 @@
               <w:bottom w:val="single" w:sz="6" w:space="0" w:color="BFBFBF" w:themeColor="background1" w:themeShade="BF"/>
               <w:right w:val="single" w:sz="6" w:space="0" w:color="BFBFBF" w:themeColor="background1" w:themeShade="BF"/>
             </w:tcBorders>
+            <w:shd w:val="clear" w:color="auto" w:fill="FFFFFF" w:themeFill="background1"/>
             <w:tcMar>
               <w:left w:w="105" w:type="dxa"/>
               <w:right w:w="105" w:type="dxa"/>
@@ -13567,6 +13633,7 @@
               <w:bottom w:val="single" w:sz="6" w:space="0" w:color="BFBFBF" w:themeColor="background1" w:themeShade="BF"/>
               <w:right w:val="single" w:sz="6" w:space="0" w:color="BFBFBF" w:themeColor="background1" w:themeShade="BF"/>
             </w:tcBorders>
+            <w:shd w:val="clear" w:color="auto" w:fill="FFFFFF" w:themeFill="background1"/>
             <w:tcMar>
               <w:left w:w="105" w:type="dxa"/>
               <w:right w:w="105" w:type="dxa"/>
@@ -13593,6 +13660,7 @@
               <w:bottom w:val="single" w:sz="6" w:space="0" w:color="BFBFBF" w:themeColor="background1" w:themeShade="BF"/>
               <w:right w:val="single" w:sz="6" w:space="0" w:color="BFBFBF" w:themeColor="background1" w:themeShade="BF"/>
             </w:tcBorders>
+            <w:shd w:val="clear" w:color="auto" w:fill="002060"/>
             <w:tcMar>
               <w:left w:w="105" w:type="dxa"/>
               <w:right w:w="105" w:type="dxa"/>
@@ -13619,6 +13687,7 @@
               <w:bottom w:val="single" w:sz="6" w:space="0" w:color="BFBFBF" w:themeColor="background1" w:themeShade="BF"/>
               <w:right w:val="single" w:sz="6" w:space="0" w:color="BFBFBF" w:themeColor="background1" w:themeShade="BF"/>
             </w:tcBorders>
+            <w:shd w:val="clear" w:color="auto" w:fill="002060"/>
             <w:tcMar>
               <w:left w:w="105" w:type="dxa"/>
               <w:right w:w="105" w:type="dxa"/>
@@ -13873,6 +13942,7 @@
                 <w:szCs w:val="16"/>
               </w:rPr>
             </w:pPr>
+            <w:proofErr w:type="spellStart"/>
             <w:r>
               <w:rPr>
                 <w:rFonts w:ascii="Calibri" w:eastAsia="Calibri" w:hAnsi="Calibri" w:cs="Calibri"/>
@@ -13881,6 +13951,7 @@
               </w:rPr>
               <w:t>Testing</w:t>
             </w:r>
+            <w:proofErr w:type="spellEnd"/>
           </w:p>
         </w:tc>
         <w:tc>
@@ -14152,6 +14223,7 @@
               <w:bottom w:val="single" w:sz="6" w:space="0" w:color="BFBFBF" w:themeColor="background1" w:themeShade="BF"/>
               <w:right w:val="single" w:sz="6" w:space="0" w:color="BFBFBF" w:themeColor="background1" w:themeShade="BF"/>
             </w:tcBorders>
+            <w:shd w:val="clear" w:color="auto" w:fill="FFD966" w:themeFill="accent4" w:themeFillTint="99"/>
             <w:tcMar>
               <w:left w:w="105" w:type="dxa"/>
               <w:right w:w="105" w:type="dxa"/>
@@ -14178,6 +14250,7 @@
               <w:bottom w:val="single" w:sz="6" w:space="0" w:color="BFBFBF" w:themeColor="background1" w:themeShade="BF"/>
               <w:right w:val="single" w:sz="6" w:space="0" w:color="BFBFBF" w:themeColor="background1" w:themeShade="BF"/>
             </w:tcBorders>
+            <w:shd w:val="clear" w:color="auto" w:fill="FFE599" w:themeFill="accent4" w:themeFillTint="66"/>
             <w:tcMar>
               <w:left w:w="105" w:type="dxa"/>
               <w:right w:w="105" w:type="dxa"/>
@@ -14685,6 +14758,7 @@
               <w:bottom w:val="single" w:sz="6" w:space="0" w:color="BFBFBF" w:themeColor="background1" w:themeShade="BF"/>
               <w:right w:val="single" w:sz="6" w:space="0" w:color="BFBFBF" w:themeColor="background1" w:themeShade="BF"/>
             </w:tcBorders>
+            <w:shd w:val="clear" w:color="auto" w:fill="BF8F00" w:themeFill="accent4" w:themeFillShade="BF"/>
             <w:tcMar>
               <w:left w:w="105" w:type="dxa"/>
               <w:right w:w="105" w:type="dxa"/>
@@ -15192,6 +15266,7 @@
               <w:bottom w:val="single" w:sz="6" w:space="0" w:color="BFBFBF" w:themeColor="background1" w:themeShade="BF"/>
               <w:right w:val="single" w:sz="6" w:space="0" w:color="BFBFBF" w:themeColor="background1" w:themeShade="BF"/>
             </w:tcBorders>
+            <w:shd w:val="clear" w:color="auto" w:fill="C00000"/>
             <w:tcMar>
               <w:left w:w="105" w:type="dxa"/>
               <w:right w:w="105" w:type="dxa"/>
@@ -15593,7 +15668,49 @@
                 <w:sz w:val="20"/>
                 <w:szCs w:val="20"/>
               </w:rPr>
-              <w:t>Uso de IA para compatibilidad de roommates</w:t>
+              <w:t xml:space="preserve">Uso de IA para compatibilidad de </w:t>
+            </w:r>
+            <w:proofErr w:type="spellStart"/>
+            <w:r>
+              <w:rPr>
+                <w:rFonts w:ascii="Calibri" w:eastAsia="Calibri" w:hAnsi="Calibri" w:cs="Calibri"/>
+                <w:i/>
+                <w:iCs/>
+                <w:color w:val="548DD4"/>
+                <w:sz w:val="20"/>
+                <w:szCs w:val="20"/>
+              </w:rPr>
+              <w:t>roommates</w:t>
+            </w:r>
+            <w:proofErr w:type="spellEnd"/>
+          </w:p>
+          <w:p>
+            <w:pPr>
+              <w:pStyle w:val="Prrafodelista"/>
+              <w:numPr>
+                <w:ilvl w:val="0"/>
+                <w:numId w:val="20"/>
+              </w:numPr>
+              <w:spacing w:line="259" w:lineRule="auto"/>
+              <w:rPr>
+                <w:rFonts w:ascii="Calibri" w:eastAsia="Calibri" w:hAnsi="Calibri" w:cs="Calibri"/>
+                <w:i/>
+                <w:iCs/>
+                <w:color w:val="548DD4"/>
+                <w:sz w:val="20"/>
+                <w:szCs w:val="20"/>
+              </w:rPr>
+            </w:pPr>
+            <w:r>
+              <w:rPr>
+                <w:rFonts w:ascii="Calibri" w:eastAsia="Calibri" w:hAnsi="Calibri" w:cs="Calibri"/>
+                <w:i/>
+                <w:iCs/>
+                <w:color w:val="548DD4"/>
+                <w:sz w:val="20"/>
+                <w:szCs w:val="20"/>
+              </w:rPr>
+              <w:t>Mapa real que muestra las propiedades del lugar indicado</w:t>
             </w:r>
           </w:p>
           <w:p>
@@ -15672,7 +15789,7 @@
 </file>
 
 <file path=word/endnotes.xml><?xml version="1.0" encoding="utf-8"?>
-<w:endnotes xmlns:wpc="http://schemas.microsoft.com/office/word/2010/wordprocessingCanvas" xmlns:cx="http://schemas.microsoft.com/office/drawing/2014/chartex" xmlns:cx1="http://schemas.microsoft.com/office/drawing/2015/9/8/chartex" xmlns:cx2="http://schemas.microsoft.com/office/drawing/2015/10/21/chartex" xmlns:cx3="http://schemas.microsoft.com/office/drawing/2016/5/9/chartex" xmlns:cx4="http://schemas.microsoft.com/office/drawing/2016/5/10/chartex" xmlns:cx5="http://schemas.microsoft.com/office/drawing/2016/5/11/chartex" xmlns:cx6="http://schemas.microsoft.com/office/drawing/2016/5/12/chartex" xmlns:cx7="http://schemas.microsoft.com/office/drawing/2016/5/13/chartex" xmlns:cx8="http://schemas.microsoft.com/office/drawing/2016/5/14/chartex" xmlns:mc="http://schemas.openxmlformats.org/markup-compatibility/2006" xmlns:aink="http://schemas.microsoft.com/office/drawing/2016/ink" xmlns:am3d="http://schemas.microsoft.com/office/drawing/2017/model3d" xmlns:o="urn:schemas-microsoft-com:office:office" xmlns:r="http://schemas.openxmlformats.org/officeDocument/2006/relationships" xmlns:m="http://schemas.openxmlformats.org/officeDocument/2006/math" xmlns:v="urn:schemas-microsoft-com:vml" xmlns:wp14="http://schemas.microsoft.com/office/word/2010/wordprocessingDrawing" xmlns:wp="http://schemas.openxmlformats.org/drawingml/2006/wordprocessingDrawing" xmlns:w10="urn:schemas-microsoft-com:office:word" xmlns:w="http://schemas.openxmlformats.org/wordprocessingml/2006/main" xmlns:w14="http://schemas.microsoft.com/office/word/2010/wordml" xmlns:w15="http://schemas.microsoft.com/office/word/2012/wordml" xmlns:w16cex="http://schemas.microsoft.com/office/word/2018/wordml/cex" xmlns:w16cid="http://schemas.microsoft.com/office/word/2016/wordml/cid" xmlns:w16="http://schemas.microsoft.com/office/word/2018/wordml" xmlns:w16sdtdh="http://schemas.microsoft.com/office/word/2020/wordml/sdtdatahash" xmlns:w16se="http://schemas.microsoft.com/office/word/2015/wordml/symex" xmlns:wpg="http://schemas.microsoft.com/office/word/2010/wordprocessingGroup" xmlns:wpi="http://schemas.microsoft.com/office/word/2010/wordprocessingInk" xmlns:wne="http://schemas.microsoft.com/office/word/2006/wordml" xmlns:wps="http://schemas.microsoft.com/office/word/2010/wordprocessingShape" mc:Ignorable="w14 w15 w16se w16cid w16 w16cex w16sdtdh wp14">
+<w:endnotes xmlns:wpc="http://schemas.microsoft.com/office/word/2010/wordprocessingCanvas" xmlns:cx="http://schemas.microsoft.com/office/drawing/2014/chartex" xmlns:cx1="http://schemas.microsoft.com/office/drawing/2015/9/8/chartex" xmlns:cx2="http://schemas.microsoft.com/office/drawing/2015/10/21/chartex" xmlns:cx3="http://schemas.microsoft.com/office/drawing/2016/5/9/chartex" xmlns:cx4="http://schemas.microsoft.com/office/drawing/2016/5/10/chartex" xmlns:cx5="http://schemas.microsoft.com/office/drawing/2016/5/11/chartex" xmlns:cx6="http://schemas.microsoft.com/office/drawing/2016/5/12/chartex" xmlns:cx7="http://schemas.microsoft.com/office/drawing/2016/5/13/chartex" xmlns:cx8="http://schemas.microsoft.com/office/drawing/2016/5/14/chartex" xmlns:mc="http://schemas.openxmlformats.org/markup-compatibility/2006" xmlns:aink="http://schemas.microsoft.com/office/drawing/2016/ink" xmlns:am3d="http://schemas.microsoft.com/office/drawing/2017/model3d" xmlns:o="urn:schemas-microsoft-com:office:office" xmlns:oel="http://schemas.microsoft.com/office/2019/extlst" xmlns:r="http://schemas.openxmlformats.org/officeDocument/2006/relationships" xmlns:m="http://schemas.openxmlformats.org/officeDocument/2006/math" xmlns:v="urn:schemas-microsoft-com:vml" xmlns:wp14="http://schemas.microsoft.com/office/word/2010/wordprocessingDrawing" xmlns:wp="http://schemas.openxmlformats.org/drawingml/2006/wordprocessingDrawing" xmlns:w10="urn:schemas-microsoft-com:office:word" xmlns:w="http://schemas.openxmlformats.org/wordprocessingml/2006/main" xmlns:w14="http://schemas.microsoft.com/office/word/2010/wordml" xmlns:w15="http://schemas.microsoft.com/office/word/2012/wordml" xmlns:w16cex="http://schemas.microsoft.com/office/word/2018/wordml/cex" xmlns:w16cid="http://schemas.microsoft.com/office/word/2016/wordml/cid" xmlns:w16="http://schemas.microsoft.com/office/word/2018/wordml" xmlns:w16du="http://schemas.microsoft.com/office/word/2023/wordml/word16du" xmlns:w16sdtdh="http://schemas.microsoft.com/office/word/2020/wordml/sdtdatahash" xmlns:w16sdtfl="http://schemas.microsoft.com/office/word/2024/wordml/sdtformatlock" xmlns:w16se="http://schemas.microsoft.com/office/word/2015/wordml/symex" xmlns:wpg="http://schemas.microsoft.com/office/word/2010/wordprocessingGroup" xmlns:wpi="http://schemas.microsoft.com/office/word/2010/wordprocessingInk" xmlns:wne="http://schemas.microsoft.com/office/word/2006/wordml" xmlns:wps="http://schemas.microsoft.com/office/word/2010/wordprocessingShape" mc:Ignorable="w14 w15 w16se w16cid w16 w16cex w16sdtdh w16sdtfl w16du wp14">
   <w:endnote w:type="separator" w:id="-1">
     <w:p>
       <w:r>
@@ -15694,7 +15811,7 @@
 </file>
 
 <file path=word/footer1.xml><?xml version="1.0" encoding="utf-8"?>
-<w:ftr xmlns:wpc="http://schemas.microsoft.com/office/word/2010/wordprocessingCanvas" xmlns:cx="http://schemas.microsoft.com/office/drawing/2014/chartex" xmlns:cx1="http://schemas.microsoft.com/office/drawing/2015/9/8/chartex" xmlns:cx2="http://schemas.microsoft.com/office/drawing/2015/10/21/chartex" xmlns:cx3="http://schemas.microsoft.com/office/drawing/2016/5/9/chartex" xmlns:cx4="http://schemas.microsoft.com/office/drawing/2016/5/10/chartex" xmlns:cx5="http://schemas.microsoft.com/office/drawing/2016/5/11/chartex" xmlns:cx6="http://schemas.microsoft.com/office/drawing/2016/5/12/chartex" xmlns:cx7="http://schemas.microsoft.com/office/drawing/2016/5/13/chartex" xmlns:cx8="http://schemas.microsoft.com/office/drawing/2016/5/14/chartex" xmlns:mc="http://schemas.openxmlformats.org/markup-compatibility/2006" xmlns:aink="http://schemas.microsoft.com/office/drawing/2016/ink" xmlns:am3d="http://schemas.microsoft.com/office/drawing/2017/model3d" xmlns:o="urn:schemas-microsoft-com:office:office" xmlns:r="http://schemas.openxmlformats.org/officeDocument/2006/relationships" xmlns:m="http://schemas.openxmlformats.org/officeDocument/2006/math" xmlns:v="urn:schemas-microsoft-com:vml" xmlns:wp14="http://schemas.microsoft.com/office/word/2010/wordprocessingDrawing" xmlns:wp="http://schemas.openxmlformats.org/drawingml/2006/wordprocessingDrawing" xmlns:w10="urn:schemas-microsoft-com:office:word" xmlns:w="http://schemas.openxmlformats.org/wordprocessingml/2006/main" xmlns:w14="http://schemas.microsoft.com/office/word/2010/wordml" xmlns:w15="http://schemas.microsoft.com/office/word/2012/wordml" xmlns:w16cex="http://schemas.microsoft.com/office/word/2018/wordml/cex" xmlns:w16cid="http://schemas.microsoft.com/office/word/2016/wordml/cid" xmlns:w16="http://schemas.microsoft.com/office/word/2018/wordml" xmlns:w16sdtdh="http://schemas.microsoft.com/office/word/2020/wordml/sdtdatahash" xmlns:w16se="http://schemas.microsoft.com/office/word/2015/wordml/symex" xmlns:wpg="http://schemas.microsoft.com/office/word/2010/wordprocessingGroup" xmlns:wpi="http://schemas.microsoft.com/office/word/2010/wordprocessingInk" xmlns:wne="http://schemas.microsoft.com/office/word/2006/wordml" xmlns:wps="http://schemas.microsoft.com/office/word/2010/wordprocessingShape" mc:Ignorable="w14 w15 w16se w16cid w16 w16cex w16sdtdh wp14">
+<w:ftr xmlns:wpc="http://schemas.microsoft.com/office/word/2010/wordprocessingCanvas" xmlns:cx="http://schemas.microsoft.com/office/drawing/2014/chartex" xmlns:cx1="http://schemas.microsoft.com/office/drawing/2015/9/8/chartex" xmlns:cx2="http://schemas.microsoft.com/office/drawing/2015/10/21/chartex" xmlns:cx3="http://schemas.microsoft.com/office/drawing/2016/5/9/chartex" xmlns:cx4="http://schemas.microsoft.com/office/drawing/2016/5/10/chartex" xmlns:cx5="http://schemas.microsoft.com/office/drawing/2016/5/11/chartex" xmlns:cx6="http://schemas.microsoft.com/office/drawing/2016/5/12/chartex" xmlns:cx7="http://schemas.microsoft.com/office/drawing/2016/5/13/chartex" xmlns:cx8="http://schemas.microsoft.com/office/drawing/2016/5/14/chartex" xmlns:mc="http://schemas.openxmlformats.org/markup-compatibility/2006" xmlns:aink="http://schemas.microsoft.com/office/drawing/2016/ink" xmlns:am3d="http://schemas.microsoft.com/office/drawing/2017/model3d" xmlns:o="urn:schemas-microsoft-com:office:office" xmlns:oel="http://schemas.microsoft.com/office/2019/extlst" xmlns:r="http://schemas.openxmlformats.org/officeDocument/2006/relationships" xmlns:m="http://schemas.openxmlformats.org/officeDocument/2006/math" xmlns:v="urn:schemas-microsoft-com:vml" xmlns:wp14="http://schemas.microsoft.com/office/word/2010/wordprocessingDrawing" xmlns:wp="http://schemas.openxmlformats.org/drawingml/2006/wordprocessingDrawing" xmlns:w10="urn:schemas-microsoft-com:office:word" xmlns:w="http://schemas.openxmlformats.org/wordprocessingml/2006/main" xmlns:w14="http://schemas.microsoft.com/office/word/2010/wordml" xmlns:w15="http://schemas.microsoft.com/office/word/2012/wordml" xmlns:w16cex="http://schemas.microsoft.com/office/word/2018/wordml/cex" xmlns:w16cid="http://schemas.microsoft.com/office/word/2016/wordml/cid" xmlns:w16="http://schemas.microsoft.com/office/word/2018/wordml" xmlns:w16du="http://schemas.microsoft.com/office/word/2023/wordml/word16du" xmlns:w16sdtdh="http://schemas.microsoft.com/office/word/2020/wordml/sdtdatahash" xmlns:w16sdtfl="http://schemas.microsoft.com/office/word/2024/wordml/sdtformatlock" xmlns:w16se="http://schemas.microsoft.com/office/word/2015/wordml/symex" xmlns:wpg="http://schemas.microsoft.com/office/word/2010/wordprocessingGroup" xmlns:wpi="http://schemas.microsoft.com/office/word/2010/wordprocessingInk" xmlns:wne="http://schemas.microsoft.com/office/word/2006/wordml" xmlns:wps="http://schemas.microsoft.com/office/word/2010/wordprocessingShape" mc:Ignorable="w14 w15 w16se w16cid w16 w16cex w16sdtdh w16sdtfl w16du wp14">
   <w:p>
     <w:pPr>
       <w:pStyle w:val="Textoindependiente"/>
@@ -15810,7 +15927,7 @@
             </wp:anchor>
           </w:drawing>
         </mc:Choice>
-        <mc:Fallback xmlns:w16sdtfl="http://schemas.microsoft.com/office/word/2024/wordml/sdtformatlock" xmlns:w16du="http://schemas.microsoft.com/office/word/2023/wordml/word16du" xmlns:oel="http://schemas.microsoft.com/office/2019/extlst">
+        <mc:Fallback>
           <w:pict>
             <v:shapetype w14:anchorId="022BCA48" id="_x0000_t202" coordsize="21600,21600" o:spt="202" path="m,l,21600r21600,l21600,xe">
               <v:stroke joinstyle="miter"/>
@@ -15876,7 +15993,7 @@
 </file>
 
 <file path=word/footnotes.xml><?xml version="1.0" encoding="utf-8"?>
-<w:footnotes xmlns:wpc="http://schemas.microsoft.com/office/word/2010/wordprocessingCanvas" xmlns:cx="http://schemas.microsoft.com/office/drawing/2014/chartex" xmlns:cx1="http://schemas.microsoft.com/office/drawing/2015/9/8/chartex" xmlns:cx2="http://schemas.microsoft.com/office/drawing/2015/10/21/chartex" xmlns:cx3="http://schemas.microsoft.com/office/drawing/2016/5/9/chartex" xmlns:cx4="http://schemas.microsoft.com/office/drawing/2016/5/10/chartex" xmlns:cx5="http://schemas.microsoft.com/office/drawing/2016/5/11/chartex" xmlns:cx6="http://schemas.microsoft.com/office/drawing/2016/5/12/chartex" xmlns:cx7="http://schemas.microsoft.com/office/drawing/2016/5/13/chartex" xmlns:cx8="http://schemas.microsoft.com/office/drawing/2016/5/14/chartex" xmlns:mc="http://schemas.openxmlformats.org/markup-compatibility/2006" xmlns:aink="http://schemas.microsoft.com/office/drawing/2016/ink" xmlns:am3d="http://schemas.microsoft.com/office/drawing/2017/model3d" xmlns:o="urn:schemas-microsoft-com:office:office" xmlns:r="http://schemas.openxmlformats.org/officeDocument/2006/relationships" xmlns:m="http://schemas.openxmlformats.org/officeDocument/2006/math" xmlns:v="urn:schemas-microsoft-com:vml" xmlns:wp14="http://schemas.microsoft.com/office/word/2010/wordprocessingDrawing" xmlns:wp="http://schemas.openxmlformats.org/drawingml/2006/wordprocessingDrawing" xmlns:w10="urn:schemas-microsoft-com:office:word" xmlns:w="http://schemas.openxmlformats.org/wordprocessingml/2006/main" xmlns:w14="http://schemas.microsoft.com/office/word/2010/wordml" xmlns:w15="http://schemas.microsoft.com/office/word/2012/wordml" xmlns:w16cex="http://schemas.microsoft.com/office/word/2018/wordml/cex" xmlns:w16cid="http://schemas.microsoft.com/office/word/2016/wordml/cid" xmlns:w16="http://schemas.microsoft.com/office/word/2018/wordml" xmlns:w16sdtdh="http://schemas.microsoft.com/office/word/2020/wordml/sdtdatahash" xmlns:w16se="http://schemas.microsoft.com/office/word/2015/wordml/symex" xmlns:wpg="http://schemas.microsoft.com/office/word/2010/wordprocessingGroup" xmlns:wpi="http://schemas.microsoft.com/office/word/2010/wordprocessingInk" xmlns:wne="http://schemas.microsoft.com/office/word/2006/wordml" xmlns:wps="http://schemas.microsoft.com/office/word/2010/wordprocessingShape" mc:Ignorable="w14 w15 w16se w16cid w16 w16cex w16sdtdh wp14">
+<w:footnotes xmlns:wpc="http://schemas.microsoft.com/office/word/2010/wordprocessingCanvas" xmlns:cx="http://schemas.microsoft.com/office/drawing/2014/chartex" xmlns:cx1="http://schemas.microsoft.com/office/drawing/2015/9/8/chartex" xmlns:cx2="http://schemas.microsoft.com/office/drawing/2015/10/21/chartex" xmlns:cx3="http://schemas.microsoft.com/office/drawing/2016/5/9/chartex" xmlns:cx4="http://schemas.microsoft.com/office/drawing/2016/5/10/chartex" xmlns:cx5="http://schemas.microsoft.com/office/drawing/2016/5/11/chartex" xmlns:cx6="http://schemas.microsoft.com/office/drawing/2016/5/12/chartex" xmlns:cx7="http://schemas.microsoft.com/office/drawing/2016/5/13/chartex" xmlns:cx8="http://schemas.microsoft.com/office/drawing/2016/5/14/chartex" xmlns:mc="http://schemas.openxmlformats.org/markup-compatibility/2006" xmlns:aink="http://schemas.microsoft.com/office/drawing/2016/ink" xmlns:am3d="http://schemas.microsoft.com/office/drawing/2017/model3d" xmlns:o="urn:schemas-microsoft-com:office:office" xmlns:oel="http://schemas.microsoft.com/office/2019/extlst" xmlns:r="http://schemas.openxmlformats.org/officeDocument/2006/relationships" xmlns:m="http://schemas.openxmlformats.org/officeDocument/2006/math" xmlns:v="urn:schemas-microsoft-com:vml" xmlns:wp14="http://schemas.microsoft.com/office/word/2010/wordprocessingDrawing" xmlns:wp="http://schemas.openxmlformats.org/drawingml/2006/wordprocessingDrawing" xmlns:w10="urn:schemas-microsoft-com:office:word" xmlns:w="http://schemas.openxmlformats.org/wordprocessingml/2006/main" xmlns:w14="http://schemas.microsoft.com/office/word/2010/wordml" xmlns:w15="http://schemas.microsoft.com/office/word/2012/wordml" xmlns:w16cex="http://schemas.microsoft.com/office/word/2018/wordml/cex" xmlns:w16cid="http://schemas.microsoft.com/office/word/2016/wordml/cid" xmlns:w16="http://schemas.microsoft.com/office/word/2018/wordml" xmlns:w16du="http://schemas.microsoft.com/office/word/2023/wordml/word16du" xmlns:w16sdtdh="http://schemas.microsoft.com/office/word/2020/wordml/sdtdatahash" xmlns:w16sdtfl="http://schemas.microsoft.com/office/word/2024/wordml/sdtformatlock" xmlns:w16se="http://schemas.microsoft.com/office/word/2015/wordml/symex" xmlns:wpg="http://schemas.microsoft.com/office/word/2010/wordprocessingGroup" xmlns:wpi="http://schemas.microsoft.com/office/word/2010/wordprocessingInk" xmlns:wne="http://schemas.microsoft.com/office/word/2006/wordml" xmlns:wps="http://schemas.microsoft.com/office/word/2010/wordprocessingShape" mc:Ignorable="w14 w15 w16se w16cid w16 w16cex w16sdtdh w16sdtfl w16du wp14">
   <w:footnote w:type="separator" w:id="-1">
     <w:p>
       <w:r>
@@ -15898,7 +16015,7 @@
 </file>
 
 <file path=word/header1.xml><?xml version="1.0" encoding="utf-8"?>
-<w:hdr xmlns:wpc="http://schemas.microsoft.com/office/word/2010/wordprocessingCanvas" xmlns:cx="http://schemas.microsoft.com/office/drawing/2014/chartex" xmlns:cx1="http://schemas.microsoft.com/office/drawing/2015/9/8/chartex" xmlns:cx2="http://schemas.microsoft.com/office/drawing/2015/10/21/chartex" xmlns:cx3="http://schemas.microsoft.com/office/drawing/2016/5/9/chartex" xmlns:cx4="http://schemas.microsoft.com/office/drawing/2016/5/10/chartex" xmlns:cx5="http://schemas.microsoft.com/office/drawing/2016/5/11/chartex" xmlns:cx6="http://schemas.microsoft.com/office/drawing/2016/5/12/chartex" xmlns:cx7="http://schemas.microsoft.com/office/drawing/2016/5/13/chartex" xmlns:cx8="http://schemas.microsoft.com/office/drawing/2016/5/14/chartex" xmlns:mc="http://schemas.openxmlformats.org/markup-compatibility/2006" xmlns:aink="http://schemas.microsoft.com/office/drawing/2016/ink" xmlns:am3d="http://schemas.microsoft.com/office/drawing/2017/model3d" xmlns:o="urn:schemas-microsoft-com:office:office" xmlns:r="http://schemas.openxmlformats.org/officeDocument/2006/relationships" xmlns:m="http://schemas.openxmlformats.org/officeDocument/2006/math" xmlns:v="urn:schemas-microsoft-com:vml" xmlns:wp14="http://schemas.microsoft.com/office/word/2010/wordprocessingDrawing" xmlns:wp="http://schemas.openxmlformats.org/drawingml/2006/wordprocessingDrawing" xmlns:w10="urn:schemas-microsoft-com:office:word" xmlns:w="http://schemas.openxmlformats.org/wordprocessingml/2006/main" xmlns:w14="http://schemas.microsoft.com/office/word/2010/wordml" xmlns:w15="http://schemas.microsoft.com/office/word/2012/wordml" xmlns:w16cex="http://schemas.microsoft.com/office/word/2018/wordml/cex" xmlns:w16cid="http://schemas.microsoft.com/office/word/2016/wordml/cid" xmlns:w16="http://schemas.microsoft.com/office/word/2018/wordml" xmlns:w16sdtdh="http://schemas.microsoft.com/office/word/2020/wordml/sdtdatahash" xmlns:w16se="http://schemas.microsoft.com/office/word/2015/wordml/symex" xmlns:wpg="http://schemas.microsoft.com/office/word/2010/wordprocessingGroup" xmlns:wpi="http://schemas.microsoft.com/office/word/2010/wordprocessingInk" xmlns:wne="http://schemas.microsoft.com/office/word/2006/wordml" xmlns:wps="http://schemas.microsoft.com/office/word/2010/wordprocessingShape" mc:Ignorable="w14 w15 w16se w16cid w16 w16cex w16sdtdh wp14">
+<w:hdr xmlns:wpc="http://schemas.microsoft.com/office/word/2010/wordprocessingCanvas" xmlns:cx="http://schemas.microsoft.com/office/drawing/2014/chartex" xmlns:cx1="http://schemas.microsoft.com/office/drawing/2015/9/8/chartex" xmlns:cx2="http://schemas.microsoft.com/office/drawing/2015/10/21/chartex" xmlns:cx3="http://schemas.microsoft.com/office/drawing/2016/5/9/chartex" xmlns:cx4="http://schemas.microsoft.com/office/drawing/2016/5/10/chartex" xmlns:cx5="http://schemas.microsoft.com/office/drawing/2016/5/11/chartex" xmlns:cx6="http://schemas.microsoft.com/office/drawing/2016/5/12/chartex" xmlns:cx7="http://schemas.microsoft.com/office/drawing/2016/5/13/chartex" xmlns:cx8="http://schemas.microsoft.com/office/drawing/2016/5/14/chartex" xmlns:mc="http://schemas.openxmlformats.org/markup-compatibility/2006" xmlns:aink="http://schemas.microsoft.com/office/drawing/2016/ink" xmlns:am3d="http://schemas.microsoft.com/office/drawing/2017/model3d" xmlns:o="urn:schemas-microsoft-com:office:office" xmlns:oel="http://schemas.microsoft.com/office/2019/extlst" xmlns:r="http://schemas.openxmlformats.org/officeDocument/2006/relationships" xmlns:m="http://schemas.openxmlformats.org/officeDocument/2006/math" xmlns:v="urn:schemas-microsoft-com:vml" xmlns:wp14="http://schemas.microsoft.com/office/word/2010/wordprocessingDrawing" xmlns:wp="http://schemas.openxmlformats.org/drawingml/2006/wordprocessingDrawing" xmlns:w10="urn:schemas-microsoft-com:office:word" xmlns:w="http://schemas.openxmlformats.org/wordprocessingml/2006/main" xmlns:w14="http://schemas.microsoft.com/office/word/2010/wordml" xmlns:w15="http://schemas.microsoft.com/office/word/2012/wordml" xmlns:w16cex="http://schemas.microsoft.com/office/word/2018/wordml/cex" xmlns:w16cid="http://schemas.microsoft.com/office/word/2016/wordml/cid" xmlns:w16="http://schemas.microsoft.com/office/word/2018/wordml" xmlns:w16du="http://schemas.microsoft.com/office/word/2023/wordml/word16du" xmlns:w16sdtdh="http://schemas.microsoft.com/office/word/2020/wordml/sdtdatahash" xmlns:w16sdtfl="http://schemas.microsoft.com/office/word/2024/wordml/sdtformatlock" xmlns:w16se="http://schemas.microsoft.com/office/word/2015/wordml/symex" xmlns:wpg="http://schemas.microsoft.com/office/word/2010/wordprocessingGroup" xmlns:wpi="http://schemas.microsoft.com/office/word/2010/wordprocessingInk" xmlns:wne="http://schemas.microsoft.com/office/word/2006/wordml" xmlns:wps="http://schemas.microsoft.com/office/word/2010/wordprocessingShape" mc:Ignorable="w14 w15 w16se w16cid w16 w16cex w16sdtdh w16sdtfl w16du wp14">
   <w:p>
     <w:pPr>
       <w:pStyle w:val="Encabezado"/>
@@ -16036,7 +16153,7 @@
 </file>
 
 <file path=word/numbering.xml><?xml version="1.0" encoding="utf-8"?>
-<w:numbering xmlns:wpc="http://schemas.microsoft.com/office/word/2010/wordprocessingCanvas" xmlns:cx="http://schemas.microsoft.com/office/drawing/2014/chartex" xmlns:cx1="http://schemas.microsoft.com/office/drawing/2015/9/8/chartex" xmlns:cx2="http://schemas.microsoft.com/office/drawing/2015/10/21/chartex" xmlns:cx3="http://schemas.microsoft.com/office/drawing/2016/5/9/chartex" xmlns:cx4="http://schemas.microsoft.com/office/drawing/2016/5/10/chartex" xmlns:cx5="http://schemas.microsoft.com/office/drawing/2016/5/11/chartex" xmlns:cx6="http://schemas.microsoft.com/office/drawing/2016/5/12/chartex" xmlns:cx7="http://schemas.microsoft.com/office/drawing/2016/5/13/chartex" xmlns:cx8="http://schemas.microsoft.com/office/drawing/2016/5/14/chartex" xmlns:mc="http://schemas.openxmlformats.org/markup-compatibility/2006" xmlns:aink="http://schemas.microsoft.com/office/drawing/2016/ink" xmlns:am3d="http://schemas.microsoft.com/office/drawing/2017/model3d" xmlns:o="urn:schemas-microsoft-com:office:office" xmlns:r="http://schemas.openxmlformats.org/officeDocument/2006/relationships" xmlns:m="http://schemas.openxmlformats.org/officeDocument/2006/math" xmlns:v="urn:schemas-microsoft-com:vml" xmlns:wp14="http://schemas.microsoft.com/office/word/2010/wordprocessingDrawing" xmlns:wp="http://schemas.openxmlformats.org/drawingml/2006/wordprocessingDrawing" xmlns:w10="urn:schemas-microsoft-com:office:word" xmlns:w="http://schemas.openxmlformats.org/wordprocessingml/2006/main" xmlns:w14="http://schemas.microsoft.com/office/word/2010/wordml" xmlns:w15="http://schemas.microsoft.com/office/word/2012/wordml" xmlns:w16cex="http://schemas.microsoft.com/office/word/2018/wordml/cex" xmlns:w16cid="http://schemas.microsoft.com/office/word/2016/wordml/cid" xmlns:w16="http://schemas.microsoft.com/office/word/2018/wordml" xmlns:w16sdtdh="http://schemas.microsoft.com/office/word/2020/wordml/sdtdatahash" xmlns:w16se="http://schemas.microsoft.com/office/word/2015/wordml/symex" xmlns:wpg="http://schemas.microsoft.com/office/word/2010/wordprocessingGroup" xmlns:wpi="http://schemas.microsoft.com/office/word/2010/wordprocessingInk" xmlns:wne="http://schemas.microsoft.com/office/word/2006/wordml" xmlns:wps="http://schemas.microsoft.com/office/word/2010/wordprocessingShape" mc:Ignorable="w14 w15 w16se w16cid w16 w16cex w16sdtdh wp14">
+<w:numbering xmlns:wpc="http://schemas.microsoft.com/office/word/2010/wordprocessingCanvas" xmlns:cx="http://schemas.microsoft.com/office/drawing/2014/chartex" xmlns:cx1="http://schemas.microsoft.com/office/drawing/2015/9/8/chartex" xmlns:cx2="http://schemas.microsoft.com/office/drawing/2015/10/21/chartex" xmlns:cx3="http://schemas.microsoft.com/office/drawing/2016/5/9/chartex" xmlns:cx4="http://schemas.microsoft.com/office/drawing/2016/5/10/chartex" xmlns:cx5="http://schemas.microsoft.com/office/drawing/2016/5/11/chartex" xmlns:cx6="http://schemas.microsoft.com/office/drawing/2016/5/12/chartex" xmlns:cx7="http://schemas.microsoft.com/office/drawing/2016/5/13/chartex" xmlns:cx8="http://schemas.microsoft.com/office/drawing/2016/5/14/chartex" xmlns:mc="http://schemas.openxmlformats.org/markup-compatibility/2006" xmlns:aink="http://schemas.microsoft.com/office/drawing/2016/ink" xmlns:am3d="http://schemas.microsoft.com/office/drawing/2017/model3d" xmlns:o="urn:schemas-microsoft-com:office:office" xmlns:oel="http://schemas.microsoft.com/office/2019/extlst" xmlns:r="http://schemas.openxmlformats.org/officeDocument/2006/relationships" xmlns:m="http://schemas.openxmlformats.org/officeDocument/2006/math" xmlns:v="urn:schemas-microsoft-com:vml" xmlns:wp14="http://schemas.microsoft.com/office/word/2010/wordprocessingDrawing" xmlns:wp="http://schemas.openxmlformats.org/drawingml/2006/wordprocessingDrawing" xmlns:w10="urn:schemas-microsoft-com:office:word" xmlns:w="http://schemas.openxmlformats.org/wordprocessingml/2006/main" xmlns:w14="http://schemas.microsoft.com/office/word/2010/wordml" xmlns:w15="http://schemas.microsoft.com/office/word/2012/wordml" xmlns:w16cex="http://schemas.microsoft.com/office/word/2018/wordml/cex" xmlns:w16cid="http://schemas.microsoft.com/office/word/2016/wordml/cid" xmlns:w16="http://schemas.microsoft.com/office/word/2018/wordml" xmlns:w16du="http://schemas.microsoft.com/office/word/2023/wordml/word16du" xmlns:w16sdtdh="http://schemas.microsoft.com/office/word/2020/wordml/sdtdatahash" xmlns:w16sdtfl="http://schemas.microsoft.com/office/word/2024/wordml/sdtformatlock" xmlns:w16se="http://schemas.microsoft.com/office/word/2015/wordml/symex" xmlns:wpg="http://schemas.microsoft.com/office/word/2010/wordprocessingGroup" xmlns:wpi="http://schemas.microsoft.com/office/word/2010/wordprocessingInk" xmlns:wne="http://schemas.microsoft.com/office/word/2006/wordml" xmlns:wps="http://schemas.microsoft.com/office/word/2010/wordprocessingShape" mc:Ignorable="w14 w15 w16se w16cid w16 w16cex w16sdtdh w16sdtfl w16du wp14">
   <w:abstractNum w:abstractNumId="0" w15:restartNumberingAfterBreak="0">
     <w:nsid w:val="101F1C0A"/>
     <w:multiLevelType w:val="hybridMultilevel"/>
@@ -16124,6 +16241,119 @@
     </w:lvl>
   </w:abstractNum>
   <w:abstractNum w:abstractNumId="1" w15:restartNumberingAfterBreak="0">
+    <w:nsid w:val="139209FF"/>
+    <w:multiLevelType w:val="hybridMultilevel"/>
+    <w:tmpl w:val="4F7CC5A8"/>
+    <w:lvl w:ilvl="0" w:tplc="340A0001">
+      <w:start w:val="1"/>
+      <w:numFmt w:val="bullet"/>
+      <w:lvlText w:val=""/>
+      <w:lvlJc w:val="left"/>
+      <w:pPr>
+        <w:ind w:left="720" w:hanging="360"/>
+      </w:pPr>
+      <w:rPr>
+        <w:rFonts w:ascii="Symbol" w:hAnsi="Symbol" w:hint="default"/>
+      </w:rPr>
+    </w:lvl>
+    <w:lvl w:ilvl="1" w:tplc="340A0003" w:tentative="1">
+      <w:start w:val="1"/>
+      <w:numFmt w:val="bullet"/>
+      <w:lvlText w:val="o"/>
+      <w:lvlJc w:val="left"/>
+      <w:pPr>
+        <w:ind w:left="1440" w:hanging="360"/>
+      </w:pPr>
+      <w:rPr>
+        <w:rFonts w:ascii="Courier New" w:hAnsi="Courier New" w:cs="Courier New" w:hint="default"/>
+      </w:rPr>
+    </w:lvl>
+    <w:lvl w:ilvl="2" w:tplc="340A0005" w:tentative="1">
+      <w:start w:val="1"/>
+      <w:numFmt w:val="bullet"/>
+      <w:lvlText w:val=""/>
+      <w:lvlJc w:val="left"/>
+      <w:pPr>
+        <w:ind w:left="2160" w:hanging="360"/>
+      </w:pPr>
+      <w:rPr>
+        <w:rFonts w:ascii="Wingdings" w:hAnsi="Wingdings" w:hint="default"/>
+      </w:rPr>
+    </w:lvl>
+    <w:lvl w:ilvl="3" w:tplc="340A0001" w:tentative="1">
+      <w:start w:val="1"/>
+      <w:numFmt w:val="bullet"/>
+      <w:lvlText w:val=""/>
+      <w:lvlJc w:val="left"/>
+      <w:pPr>
+        <w:ind w:left="2880" w:hanging="360"/>
+      </w:pPr>
+      <w:rPr>
+        <w:rFonts w:ascii="Symbol" w:hAnsi="Symbol" w:hint="default"/>
+      </w:rPr>
+    </w:lvl>
+    <w:lvl w:ilvl="4" w:tplc="340A0003" w:tentative="1">
+      <w:start w:val="1"/>
+      <w:numFmt w:val="bullet"/>
+      <w:lvlText w:val="o"/>
+      <w:lvlJc w:val="left"/>
+      <w:pPr>
+        <w:ind w:left="3600" w:hanging="360"/>
+      </w:pPr>
+      <w:rPr>
+        <w:rFonts w:ascii="Courier New" w:hAnsi="Courier New" w:cs="Courier New" w:hint="default"/>
+      </w:rPr>
+    </w:lvl>
+    <w:lvl w:ilvl="5" w:tplc="340A0005" w:tentative="1">
+      <w:start w:val="1"/>
+      <w:numFmt w:val="bullet"/>
+      <w:lvlText w:val=""/>
+      <w:lvlJc w:val="left"/>
+      <w:pPr>
+        <w:ind w:left="4320" w:hanging="360"/>
+      </w:pPr>
+      <w:rPr>
+        <w:rFonts w:ascii="Wingdings" w:hAnsi="Wingdings" w:hint="default"/>
+      </w:rPr>
+    </w:lvl>
+    <w:lvl w:ilvl="6" w:tplc="340A0001" w:tentative="1">
+      <w:start w:val="1"/>
+      <w:numFmt w:val="bullet"/>
+      <w:lvlText w:val=""/>
+      <w:lvlJc w:val="left"/>
+      <w:pPr>
+        <w:ind w:left="5040" w:hanging="360"/>
+      </w:pPr>
+      <w:rPr>
+        <w:rFonts w:ascii="Symbol" w:hAnsi="Symbol" w:hint="default"/>
+      </w:rPr>
+    </w:lvl>
+    <w:lvl w:ilvl="7" w:tplc="340A0003" w:tentative="1">
+      <w:start w:val="1"/>
+      <w:numFmt w:val="bullet"/>
+      <w:lvlText w:val="o"/>
+      <w:lvlJc w:val="left"/>
+      <w:pPr>
+        <w:ind w:left="5760" w:hanging="360"/>
+      </w:pPr>
+      <w:rPr>
+        <w:rFonts w:ascii="Courier New" w:hAnsi="Courier New" w:cs="Courier New" w:hint="default"/>
+      </w:rPr>
+    </w:lvl>
+    <w:lvl w:ilvl="8" w:tplc="340A0005" w:tentative="1">
+      <w:start w:val="1"/>
+      <w:numFmt w:val="bullet"/>
+      <w:lvlText w:val=""/>
+      <w:lvlJc w:val="left"/>
+      <w:pPr>
+        <w:ind w:left="6480" w:hanging="360"/>
+      </w:pPr>
+      <w:rPr>
+        <w:rFonts w:ascii="Wingdings" w:hAnsi="Wingdings" w:hint="default"/>
+      </w:rPr>
+    </w:lvl>
+  </w:abstractNum>
+  <w:abstractNum w:abstractNumId="2" w15:restartNumberingAfterBreak="0">
     <w:nsid w:val="1BA366CC"/>
     <w:multiLevelType w:val="multilevel"/>
     <w:tmpl w:val="E8CA21E0"/>
@@ -16272,7 +16502,7 @@
       </w:rPr>
     </w:lvl>
   </w:abstractNum>
-  <w:abstractNum w:abstractNumId="2" w15:restartNumberingAfterBreak="0">
+  <w:abstractNum w:abstractNumId="3" w15:restartNumberingAfterBreak="0">
     <w:nsid w:val="1BB053DB"/>
     <w:multiLevelType w:val="hybridMultilevel"/>
     <w:tmpl w:val="6D0E43AA"/>
@@ -16361,7 +16591,7 @@
       </w:pPr>
     </w:lvl>
   </w:abstractNum>
-  <w:abstractNum w:abstractNumId="3" w15:restartNumberingAfterBreak="0">
+  <w:abstractNum w:abstractNumId="4" w15:restartNumberingAfterBreak="0">
     <w:nsid w:val="1C5A5BCC"/>
     <w:multiLevelType w:val="hybridMultilevel"/>
     <w:tmpl w:val="EE4ECFEE"/>
@@ -16447,7 +16677,7 @@
       </w:pPr>
     </w:lvl>
   </w:abstractNum>
-  <w:abstractNum w:abstractNumId="4" w15:restartNumberingAfterBreak="0">
+  <w:abstractNum w:abstractNumId="5" w15:restartNumberingAfterBreak="0">
     <w:nsid w:val="29C77841"/>
     <w:multiLevelType w:val="hybridMultilevel"/>
     <w:tmpl w:val="D694A52A"/>
@@ -16536,7 +16766,7 @@
       </w:pPr>
     </w:lvl>
   </w:abstractNum>
-  <w:abstractNum w:abstractNumId="5" w15:restartNumberingAfterBreak="0">
+  <w:abstractNum w:abstractNumId="6" w15:restartNumberingAfterBreak="0">
     <w:nsid w:val="2E5A74FC"/>
     <w:multiLevelType w:val="hybridMultilevel"/>
     <w:tmpl w:val="6FA0A5C8"/>
@@ -16629,7 +16859,7 @@
       </w:pPr>
     </w:lvl>
   </w:abstractNum>
-  <w:abstractNum w:abstractNumId="6" w15:restartNumberingAfterBreak="0">
+  <w:abstractNum w:abstractNumId="7" w15:restartNumberingAfterBreak="0">
     <w:nsid w:val="305C6F0C"/>
     <w:multiLevelType w:val="multilevel"/>
     <w:tmpl w:val="E3721CE4"/>
@@ -16778,7 +17008,7 @@
       </w:rPr>
     </w:lvl>
   </w:abstractNum>
-  <w:abstractNum w:abstractNumId="7" w15:restartNumberingAfterBreak="0">
+  <w:abstractNum w:abstractNumId="8" w15:restartNumberingAfterBreak="0">
     <w:nsid w:val="389A3118"/>
     <w:multiLevelType w:val="multilevel"/>
     <w:tmpl w:val="191A6260"/>
@@ -16891,7 +17121,7 @@
       </w:rPr>
     </w:lvl>
   </w:abstractNum>
-  <w:abstractNum w:abstractNumId="8" w15:restartNumberingAfterBreak="0">
+  <w:abstractNum w:abstractNumId="9" w15:restartNumberingAfterBreak="0">
     <w:nsid w:val="3AA6278C"/>
     <w:multiLevelType w:val="multilevel"/>
     <w:tmpl w:val="A8380820"/>
@@ -17040,7 +17270,7 @@
       </w:rPr>
     </w:lvl>
   </w:abstractNum>
-  <w:abstractNum w:abstractNumId="9" w15:restartNumberingAfterBreak="0">
+  <w:abstractNum w:abstractNumId="10" w15:restartNumberingAfterBreak="0">
     <w:nsid w:val="422C4BB6"/>
     <w:multiLevelType w:val="multilevel"/>
     <w:tmpl w:val="8BB2BC02"/>
@@ -17153,7 +17383,7 @@
       </w:pPr>
     </w:lvl>
   </w:abstractNum>
-  <w:abstractNum w:abstractNumId="10" w15:restartNumberingAfterBreak="0">
+  <w:abstractNum w:abstractNumId="11" w15:restartNumberingAfterBreak="0">
     <w:nsid w:val="52A260DF"/>
     <w:multiLevelType w:val="multilevel"/>
     <w:tmpl w:val="4AE460D2"/>
@@ -17302,7 +17532,7 @@
       </w:rPr>
     </w:lvl>
   </w:abstractNum>
-  <w:abstractNum w:abstractNumId="11" w15:restartNumberingAfterBreak="0">
+  <w:abstractNum w:abstractNumId="12" w15:restartNumberingAfterBreak="0">
     <w:nsid w:val="52D16E84"/>
     <w:multiLevelType w:val="multilevel"/>
     <w:tmpl w:val="FD403E30"/>
@@ -17424,7 +17654,7 @@
       </w:rPr>
     </w:lvl>
   </w:abstractNum>
-  <w:abstractNum w:abstractNumId="12" w15:restartNumberingAfterBreak="0">
+  <w:abstractNum w:abstractNumId="13" w15:restartNumberingAfterBreak="0">
     <w:nsid w:val="6141421A"/>
     <w:multiLevelType w:val="multilevel"/>
     <w:tmpl w:val="2BE09302"/>
@@ -17573,7 +17803,7 @@
       </w:rPr>
     </w:lvl>
   </w:abstractNum>
-  <w:abstractNum w:abstractNumId="13" w15:restartNumberingAfterBreak="0">
+  <w:abstractNum w:abstractNumId="14" w15:restartNumberingAfterBreak="0">
     <w:nsid w:val="67FB56F1"/>
     <w:multiLevelType w:val="hybridMultilevel"/>
     <w:tmpl w:val="23A82E4C"/>
@@ -17686,7 +17916,7 @@
       </w:rPr>
     </w:lvl>
   </w:abstractNum>
-  <w:abstractNum w:abstractNumId="14" w15:restartNumberingAfterBreak="0">
+  <w:abstractNum w:abstractNumId="15" w15:restartNumberingAfterBreak="0">
     <w:nsid w:val="690F3F91"/>
     <w:multiLevelType w:val="multilevel"/>
     <w:tmpl w:val="ACDAB1DE"/>
@@ -17835,7 +18065,120 @@
       </w:rPr>
     </w:lvl>
   </w:abstractNum>
-  <w:abstractNum w:abstractNumId="15" w15:restartNumberingAfterBreak="0">
+  <w:abstractNum w:abstractNumId="16" w15:restartNumberingAfterBreak="0">
+    <w:nsid w:val="6C93066E"/>
+    <w:multiLevelType w:val="hybridMultilevel"/>
+    <w:tmpl w:val="AB22BCA2"/>
+    <w:lvl w:ilvl="0" w:tplc="340A0001">
+      <w:start w:val="1"/>
+      <w:numFmt w:val="bullet"/>
+      <w:lvlText w:val=""/>
+      <w:lvlJc w:val="left"/>
+      <w:pPr>
+        <w:ind w:left="720" w:hanging="360"/>
+      </w:pPr>
+      <w:rPr>
+        <w:rFonts w:ascii="Symbol" w:hAnsi="Symbol" w:hint="default"/>
+      </w:rPr>
+    </w:lvl>
+    <w:lvl w:ilvl="1" w:tplc="340A0003" w:tentative="1">
+      <w:start w:val="1"/>
+      <w:numFmt w:val="bullet"/>
+      <w:lvlText w:val="o"/>
+      <w:lvlJc w:val="left"/>
+      <w:pPr>
+        <w:ind w:left="1440" w:hanging="360"/>
+      </w:pPr>
+      <w:rPr>
+        <w:rFonts w:ascii="Courier New" w:hAnsi="Courier New" w:cs="Courier New" w:hint="default"/>
+      </w:rPr>
+    </w:lvl>
+    <w:lvl w:ilvl="2" w:tplc="340A0005" w:tentative="1">
+      <w:start w:val="1"/>
+      <w:numFmt w:val="bullet"/>
+      <w:lvlText w:val=""/>
+      <w:lvlJc w:val="left"/>
+      <w:pPr>
+        <w:ind w:left="2160" w:hanging="360"/>
+      </w:pPr>
+      <w:rPr>
+        <w:rFonts w:ascii="Wingdings" w:hAnsi="Wingdings" w:hint="default"/>
+      </w:rPr>
+    </w:lvl>
+    <w:lvl w:ilvl="3" w:tplc="340A0001" w:tentative="1">
+      <w:start w:val="1"/>
+      <w:numFmt w:val="bullet"/>
+      <w:lvlText w:val=""/>
+      <w:lvlJc w:val="left"/>
+      <w:pPr>
+        <w:ind w:left="2880" w:hanging="360"/>
+      </w:pPr>
+      <w:rPr>
+        <w:rFonts w:ascii="Symbol" w:hAnsi="Symbol" w:hint="default"/>
+      </w:rPr>
+    </w:lvl>
+    <w:lvl w:ilvl="4" w:tplc="340A0003" w:tentative="1">
+      <w:start w:val="1"/>
+      <w:numFmt w:val="bullet"/>
+      <w:lvlText w:val="o"/>
+      <w:lvlJc w:val="left"/>
+      <w:pPr>
+        <w:ind w:left="3600" w:hanging="360"/>
+      </w:pPr>
+      <w:rPr>
+        <w:rFonts w:ascii="Courier New" w:hAnsi="Courier New" w:cs="Courier New" w:hint="default"/>
+      </w:rPr>
+    </w:lvl>
+    <w:lvl w:ilvl="5" w:tplc="340A0005" w:tentative="1">
+      <w:start w:val="1"/>
+      <w:numFmt w:val="bullet"/>
+      <w:lvlText w:val=""/>
+      <w:lvlJc w:val="left"/>
+      <w:pPr>
+        <w:ind w:left="4320" w:hanging="360"/>
+      </w:pPr>
+      <w:rPr>
+        <w:rFonts w:ascii="Wingdings" w:hAnsi="Wingdings" w:hint="default"/>
+      </w:rPr>
+    </w:lvl>
+    <w:lvl w:ilvl="6" w:tplc="340A0001" w:tentative="1">
+      <w:start w:val="1"/>
+      <w:numFmt w:val="bullet"/>
+      <w:lvlText w:val=""/>
+      <w:lvlJc w:val="left"/>
+      <w:pPr>
+        <w:ind w:left="5040" w:hanging="360"/>
+      </w:pPr>
+      <w:rPr>
+        <w:rFonts w:ascii="Symbol" w:hAnsi="Symbol" w:hint="default"/>
+      </w:rPr>
+    </w:lvl>
+    <w:lvl w:ilvl="7" w:tplc="340A0003" w:tentative="1">
+      <w:start w:val="1"/>
+      <w:numFmt w:val="bullet"/>
+      <w:lvlText w:val="o"/>
+      <w:lvlJc w:val="left"/>
+      <w:pPr>
+        <w:ind w:left="5760" w:hanging="360"/>
+      </w:pPr>
+      <w:rPr>
+        <w:rFonts w:ascii="Courier New" w:hAnsi="Courier New" w:cs="Courier New" w:hint="default"/>
+      </w:rPr>
+    </w:lvl>
+    <w:lvl w:ilvl="8" w:tplc="340A0005" w:tentative="1">
+      <w:start w:val="1"/>
+      <w:numFmt w:val="bullet"/>
+      <w:lvlText w:val=""/>
+      <w:lvlJc w:val="left"/>
+      <w:pPr>
+        <w:ind w:left="6480" w:hanging="360"/>
+      </w:pPr>
+      <w:rPr>
+        <w:rFonts w:ascii="Wingdings" w:hAnsi="Wingdings" w:hint="default"/>
+      </w:rPr>
+    </w:lvl>
+  </w:abstractNum>
+  <w:abstractNum w:abstractNumId="17" w15:restartNumberingAfterBreak="0">
     <w:nsid w:val="76957EA7"/>
     <w:multiLevelType w:val="hybridMultilevel"/>
     <w:tmpl w:val="BF5E12EC"/>
@@ -17948,7 +18291,7 @@
       </w:rPr>
     </w:lvl>
   </w:abstractNum>
-  <w:abstractNum w:abstractNumId="16" w15:restartNumberingAfterBreak="0">
+  <w:abstractNum w:abstractNumId="18" w15:restartNumberingAfterBreak="0">
     <w:nsid w:val="78872AE6"/>
     <w:multiLevelType w:val="multilevel"/>
     <w:tmpl w:val="0B228294"/>
@@ -18097,7 +18440,7 @@
       </w:rPr>
     </w:lvl>
   </w:abstractNum>
-  <w:abstractNum w:abstractNumId="17" w15:restartNumberingAfterBreak="0">
+  <w:abstractNum w:abstractNumId="19" w15:restartNumberingAfterBreak="0">
     <w:nsid w:val="7A530717"/>
     <w:multiLevelType w:val="hybridMultilevel"/>
     <w:tmpl w:val="2332A89A"/>
@@ -18186,7 +18529,7 @@
       </w:pPr>
     </w:lvl>
   </w:abstractNum>
-  <w:abstractNum w:abstractNumId="18" w15:restartNumberingAfterBreak="0">
+  <w:abstractNum w:abstractNumId="20" w15:restartNumberingAfterBreak="0">
     <w:nsid w:val="7B7D3DD4"/>
     <w:multiLevelType w:val="multilevel"/>
     <w:tmpl w:val="4CAA89F2"/>
@@ -18335,7 +18678,93 @@
       </w:rPr>
     </w:lvl>
   </w:abstractNum>
-  <w:abstractNum w:abstractNumId="19" w15:restartNumberingAfterBreak="0">
+  <w:abstractNum w:abstractNumId="21" w15:restartNumberingAfterBreak="0">
+    <w:nsid w:val="7B943CDC"/>
+    <w:multiLevelType w:val="hybridMultilevel"/>
+    <w:tmpl w:val="186EAC10"/>
+    <w:lvl w:ilvl="0" w:tplc="340A000F">
+      <w:start w:val="1"/>
+      <w:numFmt w:val="decimal"/>
+      <w:lvlText w:val="%1."/>
+      <w:lvlJc w:val="left"/>
+      <w:pPr>
+        <w:ind w:left="720" w:hanging="360"/>
+      </w:pPr>
+    </w:lvl>
+    <w:lvl w:ilvl="1" w:tplc="340A0019" w:tentative="1">
+      <w:start w:val="1"/>
+      <w:numFmt w:val="lowerLetter"/>
+      <w:lvlText w:val="%2."/>
+      <w:lvlJc w:val="left"/>
+      <w:pPr>
+        <w:ind w:left="1440" w:hanging="360"/>
+      </w:pPr>
+    </w:lvl>
+    <w:lvl w:ilvl="2" w:tplc="340A001B" w:tentative="1">
+      <w:start w:val="1"/>
+      <w:numFmt w:val="lowerRoman"/>
+      <w:lvlText w:val="%3."/>
+      <w:lvlJc w:val="right"/>
+      <w:pPr>
+        <w:ind w:left="2160" w:hanging="180"/>
+      </w:pPr>
+    </w:lvl>
+    <w:lvl w:ilvl="3" w:tplc="340A000F" w:tentative="1">
+      <w:start w:val="1"/>
+      <w:numFmt w:val="decimal"/>
+      <w:lvlText w:val="%4."/>
+      <w:lvlJc w:val="left"/>
+      <w:pPr>
+        <w:ind w:left="2880" w:hanging="360"/>
+      </w:pPr>
+    </w:lvl>
+    <w:lvl w:ilvl="4" w:tplc="340A0019" w:tentative="1">
+      <w:start w:val="1"/>
+      <w:numFmt w:val="lowerLetter"/>
+      <w:lvlText w:val="%5."/>
+      <w:lvlJc w:val="left"/>
+      <w:pPr>
+        <w:ind w:left="3600" w:hanging="360"/>
+      </w:pPr>
+    </w:lvl>
+    <w:lvl w:ilvl="5" w:tplc="340A001B" w:tentative="1">
+      <w:start w:val="1"/>
+      <w:numFmt w:val="lowerRoman"/>
+      <w:lvlText w:val="%6."/>
+      <w:lvlJc w:val="right"/>
+      <w:pPr>
+        <w:ind w:left="4320" w:hanging="180"/>
+      </w:pPr>
+    </w:lvl>
+    <w:lvl w:ilvl="6" w:tplc="340A000F" w:tentative="1">
+      <w:start w:val="1"/>
+      <w:numFmt w:val="decimal"/>
+      <w:lvlText w:val="%7."/>
+      <w:lvlJc w:val="left"/>
+      <w:pPr>
+        <w:ind w:left="5040" w:hanging="360"/>
+      </w:pPr>
+    </w:lvl>
+    <w:lvl w:ilvl="7" w:tplc="340A0019" w:tentative="1">
+      <w:start w:val="1"/>
+      <w:numFmt w:val="lowerLetter"/>
+      <w:lvlText w:val="%8."/>
+      <w:lvlJc w:val="left"/>
+      <w:pPr>
+        <w:ind w:left="5760" w:hanging="360"/>
+      </w:pPr>
+    </w:lvl>
+    <w:lvl w:ilvl="8" w:tplc="340A001B" w:tentative="1">
+      <w:start w:val="1"/>
+      <w:numFmt w:val="lowerRoman"/>
+      <w:lvlText w:val="%9."/>
+      <w:lvlJc w:val="right"/>
+      <w:pPr>
+        <w:ind w:left="6480" w:hanging="180"/>
+      </w:pPr>
+    </w:lvl>
+  </w:abstractNum>
+  <w:abstractNum w:abstractNumId="22" w15:restartNumberingAfterBreak="0">
     <w:nsid w:val="7F437120"/>
     <w:multiLevelType w:val="hybridMultilevel"/>
     <w:tmpl w:val="57B4066E"/>
@@ -18448,72 +18877,81 @@
       </w:rPr>
     </w:lvl>
   </w:abstractNum>
-  <w:num w:numId="1">
+  <w:num w:numId="1" w16cid:durableId="1047415663">
+    <w:abstractNumId w:val="12"/>
+  </w:num>
+  <w:num w:numId="2" w16cid:durableId="251355160">
+    <w:abstractNumId w:val="22"/>
+  </w:num>
+  <w:num w:numId="3" w16cid:durableId="737556067">
+    <w:abstractNumId w:val="8"/>
+  </w:num>
+  <w:num w:numId="4" w16cid:durableId="1134176326">
+    <w:abstractNumId w:val="6"/>
+  </w:num>
+  <w:num w:numId="5" w16cid:durableId="33772997">
+    <w:abstractNumId w:val="0"/>
+  </w:num>
+  <w:num w:numId="6" w16cid:durableId="2071268930">
+    <w:abstractNumId w:val="4"/>
+  </w:num>
+  <w:num w:numId="7" w16cid:durableId="1221137445">
+    <w:abstractNumId w:val="5"/>
+  </w:num>
+  <w:num w:numId="8" w16cid:durableId="372271516">
+    <w:abstractNumId w:val="19"/>
+  </w:num>
+  <w:num w:numId="9" w16cid:durableId="190991912">
+    <w:abstractNumId w:val="14"/>
+  </w:num>
+  <w:num w:numId="10" w16cid:durableId="1294019629">
+    <w:abstractNumId w:val="17"/>
+  </w:num>
+  <w:num w:numId="11" w16cid:durableId="1474173228">
+    <w:abstractNumId w:val="3"/>
+  </w:num>
+  <w:num w:numId="12" w16cid:durableId="149293812">
+    <w:abstractNumId w:val="10"/>
+  </w:num>
+  <w:num w:numId="13" w16cid:durableId="2142184846">
+    <w:abstractNumId w:val="2"/>
+  </w:num>
+  <w:num w:numId="14" w16cid:durableId="2138840664">
+    <w:abstractNumId w:val="15"/>
+  </w:num>
+  <w:num w:numId="15" w16cid:durableId="905265325">
     <w:abstractNumId w:val="11"/>
   </w:num>
-  <w:num w:numId="2">
-    <w:abstractNumId w:val="19"/>
+  <w:num w:numId="16" w16cid:durableId="1675575450">
+    <w:abstractNumId w:val="18"/>
   </w:num>
-  <w:num w:numId="3">
+  <w:num w:numId="17" w16cid:durableId="971444524">
     <w:abstractNumId w:val="7"/>
   </w:num>
-  <w:num w:numId="4">
-    <w:abstractNumId w:val="5"/>
-  </w:num>
-  <w:num w:numId="5">
-    <w:abstractNumId w:val="0"/>
-  </w:num>
-  <w:num w:numId="6">
-    <w:abstractNumId w:val="3"/>
-  </w:num>
-  <w:num w:numId="7">
-    <w:abstractNumId w:val="4"/>
-  </w:num>
-  <w:num w:numId="8">
-    <w:abstractNumId w:val="17"/>
-  </w:num>
-  <w:num w:numId="9">
+  <w:num w:numId="18" w16cid:durableId="689186754">
     <w:abstractNumId w:val="13"/>
   </w:num>
-  <w:num w:numId="10">
-    <w:abstractNumId w:val="15"/>
-  </w:num>
-  <w:num w:numId="11">
-    <w:abstractNumId w:val="2"/>
-  </w:num>
-  <w:num w:numId="12">
+  <w:num w:numId="19" w16cid:durableId="1406564430">
     <w:abstractNumId w:val="9"/>
   </w:num>
-  <w:num w:numId="13">
+  <w:num w:numId="20" w16cid:durableId="1168790438">
+    <w:abstractNumId w:val="20"/>
+  </w:num>
+  <w:num w:numId="21" w16cid:durableId="1101871977">
+    <w:abstractNumId w:val="21"/>
+  </w:num>
+  <w:num w:numId="22" w16cid:durableId="1413433058">
     <w:abstractNumId w:val="1"/>
   </w:num>
-  <w:num w:numId="14">
-    <w:abstractNumId w:val="14"/>
-  </w:num>
-  <w:num w:numId="15">
-    <w:abstractNumId w:val="10"/>
-  </w:num>
-  <w:num w:numId="16">
+  <w:num w:numId="23" w16cid:durableId="256794162">
     <w:abstractNumId w:val="16"/>
-  </w:num>
-  <w:num w:numId="17">
-    <w:abstractNumId w:val="6"/>
-  </w:num>
-  <w:num w:numId="18">
-    <w:abstractNumId w:val="12"/>
-  </w:num>
-  <w:num w:numId="19">
-    <w:abstractNumId w:val="8"/>
-  </w:num>
-  <w:num w:numId="20">
-    <w:abstractNumId w:val="18"/>
   </w:num>
   <w:numIdMacAtCleanup w:val="4"/>
 </w:numbering>
 </file>
 
 <file path=word/styles.xml><?xml version="1.0" encoding="utf-8"?>
-<w:styles xmlns:mc="http://schemas.openxmlformats.org/markup-compatibility/2006" xmlns:r="http://schemas.openxmlformats.org/officeDocument/2006/relationships" xmlns:w="http://schemas.openxmlformats.org/wordprocessingml/2006/main" xmlns:w14="http://schemas.microsoft.com/office/word/2010/wordml" xmlns:w15="http://schemas.microsoft.com/office/word/2012/wordml" xmlns:w16cex="http://schemas.microsoft.com/office/word/2018/wordml/cex" xmlns:w16cid="http://schemas.microsoft.com/office/word/2016/wordml/cid" xmlns:w16="http://schemas.microsoft.com/office/word/2018/wordml" xmlns:w16sdtdh="http://schemas.microsoft.com/office/word/2020/wordml/sdtdatahash" xmlns:w16se="http://schemas.microsoft.com/office/word/2015/wordml/symex" mc:Ignorable="w14 w15 w16se w16cid w16 w16cex w16sdtdh">
+<w:styles xmlns:mc="http://schemas.openxmlformats.org/markup-compatibility/2006" xmlns:r="http://schemas.openxmlformats.org/officeDocument/2006/relationships" xmlns:w="http://schemas.openxmlformats.org/wordprocessingml/2006/main" xmlns:w14="http://schemas.microsoft.com/office/word/2010/wordml" xmlns:w15="http://schemas.microsoft.com/office/word/2012/wordml" xmlns:w16cex="http://schemas.microsoft.com/office/word/2018/wordml/cex" xmlns:w16cid="http://schemas.microsoft.com/office/word/2016/wordml/cid" xmlns:w16="http://schemas.microsoft.com/office/word/2018/wordml" xmlns:w16du="http://schemas.microsoft.com/office/word/2023/wordml/word16du" xmlns:w16sdtdh="http://schemas.microsoft.com/office/word/2020/wordml/sdtdatahash" xmlns:w16sdtfl="http://schemas.microsoft.com/office/word/2024/wordml/sdtformatlock" xmlns:w16se="http://schemas.microsoft.com/office/word/2015/wordml/symex" mc:Ignorable="w14 w15 w16se w16cid w16 w16cex w16sdtdh w16sdtfl w16du">
   <w:docDefaults>
     <w:rPrDefault>
       <w:rPr>
@@ -20132,19 +20570,6 @@
 </file>
 
 <file path=customXml/item2.xml><?xml version="1.0" encoding="utf-8"?>
-<b:Sources xmlns:b="http://schemas.openxmlformats.org/officeDocument/2006/bibliography" xmlns="http://schemas.openxmlformats.org/officeDocument/2006/bibliography" SelectedStyle="/APASixthEditionOfficeOnline.xsl" StyleName="APA" Version="6"/>
-</file>
-
-<file path=customXml/item3.xml><?xml version="1.0" encoding="utf-8"?>
-<?mso-contentType ?>
-<FormTemplates xmlns="http://schemas.microsoft.com/sharepoint/v3/contenttype/forms">
-  <Display>DocumentLibraryForm</Display>
-  <Edit>DocumentLibraryForm</Edit>
-  <New>DocumentLibraryForm</New>
-</FormTemplates>
-</file>
-
-<file path=customXml/item4.xml><?xml version="1.0" encoding="utf-8"?>
 <ct:contentTypeSchema xmlns:ct="http://schemas.microsoft.com/office/2006/metadata/contentType" xmlns:ma="http://schemas.microsoft.com/office/2006/metadata/properties/metaAttributes" ct:_="" ma:_="" ma:contentTypeName="Documento" ma:contentTypeID="0x010100AF28BDBD65D93F4BA99B6439AFEA320E" ma:contentTypeVersion="10" ma:contentTypeDescription="Crear nuevo documento." ma:contentTypeScope="" ma:versionID="11d45d99e0339591c68aad091688ac92">
   <xsd:schema xmlns:xsd="http://www.w3.org/2001/XMLSchema" xmlns:xs="http://www.w3.org/2001/XMLSchema" xmlns:p="http://schemas.microsoft.com/office/2006/metadata/properties" xmlns:ns2="9b0ef35d-78e7-41bf-847f-3c0497ad5352" xmlns:ns3="3c969135-7855-44e0-a9fe-01d799f07605" targetNamespace="http://schemas.microsoft.com/office/2006/metadata/properties" ma:root="true" ma:fieldsID="0e603a3f7bf67670d682b80385fe4b00" ns2:_="" ns3:_="">
     <xsd:import namespace="9b0ef35d-78e7-41bf-847f-3c0497ad5352"/>
@@ -20345,6 +20770,19 @@
 </ct:contentTypeSchema>
 </file>
 
+<file path=customXml/item3.xml><?xml version="1.0" encoding="utf-8"?>
+<?mso-contentType ?>
+<FormTemplates xmlns="http://schemas.microsoft.com/sharepoint/v3/contenttype/forms">
+  <Display>DocumentLibraryForm</Display>
+  <Edit>DocumentLibraryForm</Edit>
+  <New>DocumentLibraryForm</New>
+</FormTemplates>
+</file>
+
+<file path=customXml/item4.xml><?xml version="1.0" encoding="utf-8"?>
+<b:Sources xmlns:b="http://schemas.openxmlformats.org/officeDocument/2006/bibliography" xmlns="http://schemas.openxmlformats.org/officeDocument/2006/bibliography" SelectedStyle="/APASixthEditionOfficeOnline.xsl" StyleName="APA" Version="6"/>
+</file>
+
 <file path=customXml/itemProps1.xml><?xml version="1.0" encoding="utf-8"?>
 <ds:datastoreItem xmlns:ds="http://schemas.openxmlformats.org/officeDocument/2006/customXml" ds:itemID="{1F0F8696-2F11-4ED2-B3BB-20313B5F1328}">
   <ds:schemaRefs>
@@ -20355,22 +20793,6 @@
 </file>
 
 <file path=customXml/itemProps2.xml><?xml version="1.0" encoding="utf-8"?>
-<ds:datastoreItem xmlns:ds="http://schemas.openxmlformats.org/officeDocument/2006/customXml" ds:itemID="{7BCEAE7D-0658-4599-9467-160E0680ABF1}">
-  <ds:schemaRefs>
-    <ds:schemaRef ds:uri="http://schemas.openxmlformats.org/officeDocument/2006/bibliography"/>
-  </ds:schemaRefs>
-</ds:datastoreItem>
-</file>
-
-<file path=customXml/itemProps3.xml><?xml version="1.0" encoding="utf-8"?>
-<ds:datastoreItem xmlns:ds="http://schemas.openxmlformats.org/officeDocument/2006/customXml" ds:itemID="{836CD6ED-D121-451D-9009-89041862BDCC}">
-  <ds:schemaRefs>
-    <ds:schemaRef ds:uri="http://schemas.microsoft.com/sharepoint/v3/contenttype/forms"/>
-  </ds:schemaRefs>
-</ds:datastoreItem>
-</file>
-
-<file path=customXml/itemProps4.xml><?xml version="1.0" encoding="utf-8"?>
 <ds:datastoreItem xmlns:ds="http://schemas.openxmlformats.org/officeDocument/2006/customXml" ds:itemID="{45AF2103-6344-4B3B-BBB6-7B451BD9DA8A}">
   <ds:schemaRefs>
     <ds:schemaRef ds:uri="http://schemas.microsoft.com/office/2006/metadata/contentType"/>
@@ -20387,4 +20809,20 @@
     <ds:schemaRef ds:uri="http://schemas.microsoft.com/internal/obd"/>
   </ds:schemaRefs>
 </ds:datastoreItem>
+</file>
+
+<file path=customXml/itemProps3.xml><?xml version="1.0" encoding="utf-8"?>
+<ds:datastoreItem xmlns:ds="http://schemas.openxmlformats.org/officeDocument/2006/customXml" ds:itemID="{836CD6ED-D121-451D-9009-89041862BDCC}">
+  <ds:schemaRefs>
+    <ds:schemaRef ds:uri="http://schemas.microsoft.com/sharepoint/v3/contenttype/forms"/>
+  </ds:schemaRefs>
+</ds:datastoreItem>
+</file>
+
+<file path=customXml/itemProps4.xml><?xml version="1.0" encoding="utf-8"?>
+<ds:datastoreItem xmlns:ds="http://schemas.openxmlformats.org/officeDocument/2006/customXml" ds:itemID="{7BCEAE7D-0658-4599-9467-160E0680ABF1}">
+  <ds:schemaRefs>
+    <ds:schemaRef ds:uri="http://schemas.openxmlformats.org/officeDocument/2006/bibliography"/>
+  </ds:schemaRefs>
+</ds:datastoreItem>
 </file>
</xml_diff>